<commit_message>
Memoria: corregir discrepancias con el código y añadir versión PDF
- Quita cercanía: 8 criterios y 18 preguntas
- El motor no elige la siguiente pregunta; las preguntas van en orden fijo
- M1 como aviso con umbral fijo del 70 % y "Los que más se ajustan"
- Pruebas 7 y 8 como en tests.ts, nuevo caso 11b y columna Obtenido rellena
- Fórmula de compatibilidad como ecuación, justificación de TypeScript,
  funciones adicionales y enlace al repositorio
- PDF exportado desde la versión corregida

Co-Authored-By: Claude Opus 5.5 <noreply@anthropic.com>
</commit_message>
<xml_diff>
--- a/docs/Memoria_sistExperto.docx
+++ b/docs/Memoria_sistExperto.docx
@@ -159,7 +159,7 @@
         <w:rPr>
           <w:rtl w:val="0"/>
         </w:rPr>
-        <w:t xml:space="preserve"> presupuesto diario, días, mes, horas de vuelo máximas, compañía, trámite de entrada aceptado, vacunas, riesgo, clima, lluvia y 9 preferencias en escala 1 a 5.</w:t>
+        <w:t xml:space="preserve"> presupuesto diario, días, mes, horas de vuelo máximas, compañía, trámite de entrada aceptado, vacunas, riesgo, clima, lluvia y 8 preferencias en escala 1 a 5.</w:t>
       </w:r>
     </w:p>
     <w:p>
@@ -256,7 +256,7 @@
         <w:rPr>
           <w:rtl w:val="0"/>
         </w:rPr>
-        <w:t xml:space="preserve">Los 15 casos de prueba dan el resultado esperado.</w:t>
+        <w:t xml:space="preserve">Los 15 casos de prueba y el caso 11b dan el resultado esperado.</w:t>
       </w:r>
     </w:p>
     <w:p>
@@ -1177,7 +1177,7 @@
               <w:rPr>
                 <w:rtl w:val="0"/>
               </w:rPr>
-              <w:t xml:space="preserve">Recopilar conocimiento: 40 países y 12 atributos</w:t>
+              <w:t xml:space="preserve">Recopilar conocimiento: 40 países y 11 atributos</w:t>
             </w:r>
           </w:p>
         </w:tc>
@@ -3462,7 +3462,7 @@
               <w:rPr>
                 <w:rtl w:val="0"/>
               </w:rPr>
-              <w:t xml:space="preserve">Hace las preguntas y muestra el resultado</w:t>
+              <w:t xml:space="preserve">Hace las 18 preguntas en orden fijo y muestra el resultado</w:t>
             </w:r>
           </w:p>
         </w:tc>
@@ -3766,7 +3766,7 @@
               <w:rPr>
                 <w:rtl w:val="0"/>
               </w:rPr>
-              <w:t xml:space="preserve">Aplica filtros, calcula la puntuación y elige la siguiente pregunta</w:t>
+              <w:t xml:space="preserve">Aplica filtros, calcula la puntuación, ordena con desempates y detecta conflictos</w:t>
             </w:r>
           </w:p>
         </w:tc>
@@ -3926,7 +3926,7 @@
               <w:rPr>
                 <w:rtl w:val="0"/>
               </w:rPr>
-              <w:t xml:space="preserve">: 40 países con 11 atributos y clima, 9 criterios, 18 reglas y 19 preguntas</w:t>
+              <w:t xml:space="preserve">: 40 países con 11 atributos y clima, 8 criterios, 18 reglas y 18 preguntas</w:t>
             </w:r>
           </w:p>
         </w:tc>
@@ -4195,7 +4195,7 @@
         <w:rPr>
           <w:rtl w:val="0"/>
         </w:rPr>
-        <w:t xml:space="preserve">El stack es el que ofrece Google AI Studio en modo Build (React con Node), sin servicios externos ni base de datos.</w:t>
+        <w:t xml:space="preserve">El stack es el que ofrece Google AI Studio en modo Build: React y TypeScript, empaquetado con Vite. La aplicación se ejecuta entera en el navegador, sin servidor propio, servicios externos ni base de datos.</w:t>
       </w:r>
     </w:p>
     <w:tbl>
@@ -5023,6 +5023,26 @@
           <w:rtl w:val="0"/>
         </w:rPr>
         <w:t xml:space="preserve"> un LLM daría respuestas distintas ante la misma entrada y no podría justificarlas con reglas comprobables. La IA se ha usado para construir y documentar el sistema, no para decidir en ejecución.</w:t>
+      </w:r>
+    </w:p>
+    <w:p>
+      <w:pPr>
+        <w:spacing w:after="240" w:before="240" w:lineRule="auto"/>
+        <w:rPr/>
+      </w:pPr>
+      <w:r>
+        <w:rPr>
+          <w:b w:val="1"/>
+          <w:bCs w:val="1"/>
+          <w:rtl w:val="0"/>
+        </w:rPr>
+        <w:t xml:space="preserve">Por qué TypeScript y no Python:</w:t>
+      </w:r>
+      <w:r>
+        <w:rPr>
+          <w:rtl w:val="0"/>
+        </w:rPr>
+        <w:t xml:space="preserve"> Google AI Studio publica aplicaciones React y TypeScript que se ejecutan sin servidor propio. El motor es determinista y corre entero en el navegador, sin llamar a ninguna API. El conocimiento está en un JSON independiente del lenguaje, así que el motor no depende de cómo se generó. Python solo se usa fuera de la aplicación, en data/cargar_conocimiento.py, para generar ese JSON a partir de la plantilla de datos.</w:t>
       </w:r>
     </w:p>
     <w:p>
@@ -7215,7 +7235,7 @@
         <w:rPr>
           <w:rtl w:val="0"/>
         </w:rPr>
-        <w:t xml:space="preserve"> Cinco criterios usan quintiles entre los 40 países (cultura, naturaleza, gastronomía, precio y cercanía; precio y cercanía se invierten); los empates reciben el rango medio. Tres usan un mapa fijo: playa (Sí 5, No 1), seguridad (Bajo riesgo 5, medio 3, alto 1) e inglés (Muy alto 5 a Muy bajo 1). Un dato SIN DATO vale 3. El clima es el noveno criterio y su afinidad se calcula en ejecución con el mes elegido (regla P2).</w:t>
+        <w:t xml:space="preserve"> Cuatro criterios usan quintiles entre los 40 países (cultura, naturaleza, gastronomía y precio; precio se invierte); los empates reciben el rango medio. Tres usan un mapa fijo: playa (Sí 5, No 1), seguridad (Bajo riesgo 5, medio 3, alto 1) e inglés (Muy alto 5 a Muy bajo 1). Un dato SIN DATO vale 3. El clima es el octavo criterio y su afinidad se calcula en ejecución con el mes elegido (regla P2).</w:t>
       </w:r>
     </w:p>
     <w:p>
@@ -10402,90 +10422,91 @@
               <w:rPr>
                 <w:rtl w:val="0"/>
               </w:rPr>
-              <w:t xml:space="preserve">ningún país cumple todos los filtros</w:t>
-            </w:r>
-          </w:p>
-        </w:tc>
-        <w:tc>
-          <w:tcPr>
-            <w:tcBorders>
-              <w:top w:color="000000" w:space="0" w:sz="0" w:val="nil"/>
-              <w:left w:color="000000" w:space="0" w:sz="0" w:val="nil"/>
-              <w:bottom w:color="000000" w:space="0" w:sz="0" w:val="nil"/>
-              <w:right w:color="000000" w:space="0" w:sz="0" w:val="nil"/>
-            </w:tcBorders>
-            <w:tcMar>
-              <w:top w:w="100.0" w:type="dxa"/>
-              <w:left w:w="100.0" w:type="dxa"/>
-              <w:bottom w:w="100.0" w:type="dxa"/>
-              <w:right w:w="100.0" w:type="dxa"/>
-            </w:tcMar>
-            <w:vAlign w:val="top"/>
-          </w:tcPr>
-          <w:p>
-            <w:pPr>
-              <w:spacing w:after="240" w:before="240" w:lineRule="auto"/>
-              <w:rPr/>
-            </w:pPr>
-            <w:r>
-              <w:rPr>
-                <w:rtl w:val="0"/>
-              </w:rPr>
-              <w:t xml:space="preserve">Muestra los que casi cumplen, con las reglas incumplidas y su margen</w:t>
-            </w:r>
-          </w:p>
-        </w:tc>
-        <w:tc>
-          <w:tcPr>
-            <w:tcBorders>
-              <w:top w:color="000000" w:space="0" w:sz="0" w:val="nil"/>
-              <w:left w:color="000000" w:space="0" w:sz="0" w:val="nil"/>
-              <w:bottom w:color="000000" w:space="0" w:sz="0" w:val="nil"/>
-              <w:right w:color="000000" w:space="0" w:sz="0" w:val="nil"/>
-            </w:tcBorders>
-            <w:tcMar>
-              <w:top w:w="100.0" w:type="dxa"/>
-              <w:left w:w="100.0" w:type="dxa"/>
-              <w:bottom w:w="100.0" w:type="dxa"/>
-              <w:right w:w="100.0" w:type="dxa"/>
-            </w:tcMar>
-            <w:vAlign w:val="top"/>
-          </w:tcPr>
-          <w:p>
-            <w:pPr>
-              <w:rPr/>
-            </w:pPr>
-            <w:r>
-              <w:rPr>
-                <w:rtl w:val="0"/>
-              </w:rPr>
-            </w:r>
-          </w:p>
-        </w:tc>
-        <w:tc>
-          <w:tcPr>
-            <w:tcBorders>
-              <w:top w:color="000000" w:space="0" w:sz="0" w:val="nil"/>
-              <w:left w:color="000000" w:space="0" w:sz="0" w:val="nil"/>
-              <w:bottom w:color="000000" w:space="0" w:sz="0" w:val="nil"/>
-              <w:right w:color="000000" w:space="0" w:sz="0" w:val="nil"/>
-            </w:tcBorders>
-            <w:tcMar>
-              <w:top w:w="100.0" w:type="dxa"/>
-              <w:left w:w="100.0" w:type="dxa"/>
-              <w:bottom w:w="100.0" w:type="dxa"/>
-              <w:right w:w="100.0" w:type="dxa"/>
-            </w:tcMar>
-            <w:vAlign w:val="top"/>
-          </w:tcPr>
-          <w:p>
-            <w:pPr>
-              <w:rPr/>
-            </w:pPr>
-            <w:r>
-              <w:rPr>
-                <w:rtl w:val="0"/>
-              </w:rPr>
+              <w:t xml:space="preserve">el mejor país mostrado no llega al 70 % de compatibilidad</w:t>
+            </w:r>
+          </w:p>
+        </w:tc>
+        <w:tc>
+          <w:tcPr>
+            <w:tcBorders>
+              <w:top w:color="000000" w:space="0" w:sz="0" w:val="nil"/>
+              <w:left w:color="000000" w:space="0" w:sz="0" w:val="nil"/>
+              <w:bottom w:color="000000" w:space="0" w:sz="0" w:val="nil"/>
+              <w:right w:color="000000" w:space="0" w:sz="0" w:val="nil"/>
+            </w:tcBorders>
+            <w:tcMar>
+              <w:top w:w="100.0" w:type="dxa"/>
+              <w:left w:w="100.0" w:type="dxa"/>
+              <w:bottom w:w="100.0" w:type="dxa"/>
+              <w:right w:w="100.0" w:type="dxa"/>
+            </w:tcMar>
+            <w:vAlign w:val="top"/>
+          </w:tcPr>
+          <w:p>
+            <w:pPr>
+              <w:spacing w:after="240" w:before="240" w:lineRule="auto"/>
+              <w:rPr/>
+            </w:pPr>
+            <w:r>
+              <w:rPr>
+                <w:rtl w:val="0"/>
+              </w:rPr>
+              <w:t xml:space="preserve">Avisa. Si ningún país cumple todos los filtros, se muestran "Los que más se ajustan" con las reglas incumplidas y su margen</w:t>
+            </w:r>
+          </w:p>
+        </w:tc>
+        <w:tc>
+          <w:tcPr>
+            <w:tcBorders>
+              <w:top w:color="000000" w:space="0" w:sz="0" w:val="nil"/>
+              <w:left w:color="000000" w:space="0" w:sz="0" w:val="nil"/>
+              <w:bottom w:color="000000" w:space="0" w:sz="0" w:val="nil"/>
+              <w:right w:color="000000" w:space="0" w:sz="0" w:val="nil"/>
+            </w:tcBorders>
+            <w:tcMar>
+              <w:top w:w="100.0" w:type="dxa"/>
+              <w:left w:w="100.0" w:type="dxa"/>
+              <w:bottom w:w="100.0" w:type="dxa"/>
+              <w:right w:w="100.0" w:type="dxa"/>
+            </w:tcMar>
+            <w:vAlign w:val="top"/>
+          </w:tcPr>
+          <w:p>
+            <w:pPr>
+              <w:rPr/>
+            </w:pPr>
+            <w:r>
+              <w:rPr>
+                <w:rtl w:val="0"/>
+              </w:rPr>
+            </w:r>
+          </w:p>
+        </w:tc>
+        <w:tc>
+          <w:tcPr>
+            <w:tcBorders>
+              <w:top w:color="000000" w:space="0" w:sz="0" w:val="nil"/>
+              <w:left w:color="000000" w:space="0" w:sz="0" w:val="nil"/>
+              <w:bottom w:color="000000" w:space="0" w:sz="0" w:val="nil"/>
+              <w:right w:color="000000" w:space="0" w:sz="0" w:val="nil"/>
+            </w:tcBorders>
+            <w:tcMar>
+              <w:top w:w="100.0" w:type="dxa"/>
+              <w:left w:w="100.0" w:type="dxa"/>
+              <w:bottom w:w="100.0" w:type="dxa"/>
+              <w:right w:w="100.0" w:type="dxa"/>
+            </w:tcMar>
+            <w:vAlign w:val="top"/>
+          </w:tcPr>
+          <w:p>
+            <w:pPr>
+              <w:rPr/>
+            </w:pPr>
+            <w:r>
+              <w:rPr>
+                <w:rtl w:val="0"/>
+              </w:rPr>
+              <w:t xml:space="preserve">Sí: 70 % (fijo)</w:t>
             </w:r>
           </w:p>
         </w:tc>
@@ -10608,7 +10629,7 @@
               <w:rPr>
                 <w:rtl w:val="0"/>
               </w:rPr>
-              <w:t xml:space="preserve">Completa hasta 3 con los que casi cumplen</w:t>
+              <w:t xml:space="preserve">Completa hasta 3 con los que más se ajustan</w:t>
             </w:r>
           </w:p>
         </w:tc>
@@ -10960,6 +10981,30 @@
     </w:p>
     <w:p>
       <w:pPr>
+        <w:numPr>
+          <w:ilvl w:val="0"/>
+          <w:numId w:val="12"/>
+        </w:numPr>
+        <w:spacing w:after="0" w:afterAutospacing="0" w:before="0" w:beforeAutospacing="0" w:lineRule="auto"/>
+        <w:ind w:left="720" w:hanging="360"/>
+      </w:pPr>
+      <w:r>
+        <w:rPr>
+          <w:b w:val="1"/>
+          <w:bCs w:val="1"/>
+          <w:rtl w:val="0"/>
+        </w:rPr>
+        <w:t xml:space="preserve">M1:</w:t>
+      </w:r>
+      <w:r>
+        <w:rPr>
+          <w:rtl w:val="0"/>
+        </w:rPr>
+        <w:t xml:space="preserve"> el aviso salta si el mejor país mostrado no llega al 70 % de compatibilidad, cumpla o no todos los filtros. El valor es fijo (constante UMBRAL_M1_FIJO en src/engine/inference.ts). [Pendiente: justificar por qué el 70 %.]</w:t>
+      </w:r>
+    </w:p>
+    <w:p>
+      <w:pPr>
         <w:spacing w:after="240" w:before="240" w:lineRule="auto"/>
         <w:rPr/>
       </w:pPr>
@@ -11066,14 +11111,94 @@
     </w:p>
     <w:p>
       <w:pPr>
-        <w:rPr/>
-      </w:pPr>
-      <w:r>
-        <w:rPr>
-          <w:rtl w:val="0"/>
-        </w:rPr>
-        <w:t xml:space="preserve">\text{Compatibilidad} = \frac{\sum_i p_i \cdot a_i}{\sum_i 5\,p_i} \times 100</w:t>
-      </w:r>
+        <w:jc w:val="center"/>
+      </w:pPr>
+      <m:oMathPara>
+        <m:oMath>
+          <m:r>
+            <m:t>Compatibilidad=</m:t>
+          </m:r>
+          <m:f>
+            <m:num>
+              <m:nary>
+                <m:naryPr>
+                  <m:chr m:val="∑"/>
+                  <m:supHide m:val="1"/>
+                </m:naryPr>
+                <m:sub>
+                  <m:r>
+                    <m:t>i</m:t>
+                  </m:r>
+                </m:sub>
+                <m:sup/>
+                <m:e>
+                  <m:sSub>
+                    <m:e>
+                      <m:r>
+                        <m:t>p</m:t>
+                      </m:r>
+                    </m:e>
+                    <m:sub>
+                      <m:r>
+                        <m:t>i</m:t>
+                      </m:r>
+                    </m:sub>
+                  </m:sSub>
+                  <m:r>
+                    <m:t>·</m:t>
+                  </m:r>
+                  <m:sSub>
+                    <m:e>
+                      <m:r>
+                        <m:t>a</m:t>
+                      </m:r>
+                    </m:e>
+                    <m:sub>
+                      <m:r>
+                        <m:t>i</m:t>
+                      </m:r>
+                    </m:sub>
+                  </m:sSub>
+                </m:e>
+              </m:nary>
+            </m:num>
+            <m:den>
+              <m:nary>
+                <m:naryPr>
+                  <m:chr m:val="∑"/>
+                  <m:supHide m:val="1"/>
+                </m:naryPr>
+                <m:sub>
+                  <m:r>
+                    <m:t>i</m:t>
+                  </m:r>
+                </m:sub>
+                <m:sup/>
+                <m:e>
+                  <m:r>
+                    <m:t>5</m:t>
+                  </m:r>
+                  <m:sSub>
+                    <m:e>
+                      <m:r>
+                        <m:t>p</m:t>
+                      </m:r>
+                    </m:e>
+                    <m:sub>
+                      <m:r>
+                        <m:t>i</m:t>
+                      </m:r>
+                    </m:sub>
+                  </m:sSub>
+                </m:e>
+              </m:nary>
+            </m:den>
+          </m:f>
+          <m:r>
+            <m:t>×100</m:t>
+          </m:r>
+        </m:oMath>
+      </m:oMathPara>
     </w:p>
     <w:p>
       <w:pPr>
@@ -11277,7 +11402,7 @@
         <w:rPr>
           <w:rtl w:val="0"/>
         </w:rPr>
-        <w:t xml:space="preserve"> el sistema muestra la sección "Casi cumplen" con los países que incumplen menos reglas, el margen de cada regla incumplida y la propuesta de relajar el filtro que más países eliminó; si es F10, propone bajar el 5 a 4 (M1). Nunca hay pantalla vacía.</w:t>
+        <w:t xml:space="preserve"> el sistema muestra la sección "Los que más se ajustan" con los países que incumplen menos reglas, el margen de cada regla incumplida y la propuesta de relajar el filtro que más países eliminó; si es F10, propone bajar el 5 a 4. Si el mejor no llega al 70 % de compatibilidad, se añade el aviso M1. Nunca hay pantalla vacía.</w:t>
       </w:r>
     </w:p>
     <w:p>
@@ -11301,7 +11426,7 @@
         <w:rPr>
           <w:rtl w:val="0"/>
         </w:rPr>
-        <w:t xml:space="preserve"> se completa hasta 3 con los que casi cumplen, marcados como tales (M2).</w:t>
+        <w:t xml:space="preserve"> se completa hasta 3 con los que más se ajustan, marcados como tales (M2).</w:t>
       </w:r>
     </w:p>
     <w:p>
@@ -11339,7 +11464,7 @@
         <w:rPr>
           <w:rtl w:val="0"/>
         </w:rPr>
-        <w:t xml:space="preserve">El sistema hace 19 preguntas, una por pantalla: 10 de restricción (descartan países) y 9 de preferencia en escala de 1 (poco) a 5 (mucho), con la opción "Me da igual" (peso 0). Las de preferencia se pueden saltar. Un 5 se interpreta como requisito (F10).</w:t>
+        <w:t xml:space="preserve">El sistema hace 18 preguntas, una por pantalla y en orden fijo: 10 de restricción (descartan países) y 8 de preferencia en escala de 1 (poco) a 5 (mucho), con la opción "Me da igual" (peso 0). Las de preferencia se pueden saltar. Un 5 se interpreta como requisito (F10).</w:t>
       </w:r>
     </w:p>
     <w:tbl>
@@ -13490,129 +13615,6 @@
       <w:tr>
         <w:trPr>
           <w:cantSplit w:val="0"/>
-          <w:trHeight w:val="500" w:hRule="atLeast"/>
-          <w:tblHeader w:val="0"/>
-        </w:trPr>
-        <w:tc>
-          <w:tcPr>
-            <w:tcBorders>
-              <w:top w:color="000000" w:space="0" w:sz="0" w:val="nil"/>
-              <w:left w:color="000000" w:space="0" w:sz="0" w:val="nil"/>
-              <w:bottom w:color="000000" w:space="0" w:sz="0" w:val="nil"/>
-              <w:right w:color="000000" w:space="0" w:sz="0" w:val="nil"/>
-            </w:tcBorders>
-            <w:tcMar>
-              <w:top w:w="100.0" w:type="dxa"/>
-              <w:left w:w="100.0" w:type="dxa"/>
-              <w:bottom w:w="100.0" w:type="dxa"/>
-              <w:right w:w="100.0" w:type="dxa"/>
-            </w:tcMar>
-            <w:vAlign w:val="top"/>
-          </w:tcPr>
-          <w:p>
-            <w:pPr>
-              <w:spacing w:after="240" w:before="240" w:lineRule="auto"/>
-              <w:rPr/>
-            </w:pPr>
-            <w:r>
-              <w:rPr>
-                <w:rtl w:val="0"/>
-              </w:rPr>
-              <w:t xml:space="preserve">E_cercania</w:t>
-            </w:r>
-          </w:p>
-        </w:tc>
-        <w:tc>
-          <w:tcPr>
-            <w:tcBorders>
-              <w:top w:color="000000" w:space="0" w:sz="0" w:val="nil"/>
-              <w:left w:color="000000" w:space="0" w:sz="0" w:val="nil"/>
-              <w:bottom w:color="000000" w:space="0" w:sz="0" w:val="nil"/>
-              <w:right w:color="000000" w:space="0" w:sz="0" w:val="nil"/>
-            </w:tcBorders>
-            <w:tcMar>
-              <w:top w:w="100.0" w:type="dxa"/>
-              <w:left w:w="100.0" w:type="dxa"/>
-              <w:bottom w:w="100.0" w:type="dxa"/>
-              <w:right w:w="100.0" w:type="dxa"/>
-            </w:tcMar>
-            <w:vAlign w:val="top"/>
-          </w:tcPr>
-          <w:p>
-            <w:pPr>
-              <w:spacing w:after="240" w:before="240" w:lineRule="auto"/>
-              <w:rPr/>
-            </w:pPr>
-            <w:r>
-              <w:rPr>
-                <w:rtl w:val="0"/>
-              </w:rPr>
-              <w:t xml:space="preserve">Cuánto importa que el vuelo sea corto</w:t>
-            </w:r>
-          </w:p>
-        </w:tc>
-        <w:tc>
-          <w:tcPr>
-            <w:tcBorders>
-              <w:top w:color="000000" w:space="0" w:sz="0" w:val="nil"/>
-              <w:left w:color="000000" w:space="0" w:sz="0" w:val="nil"/>
-              <w:bottom w:color="000000" w:space="0" w:sz="0" w:val="nil"/>
-              <w:right w:color="000000" w:space="0" w:sz="0" w:val="nil"/>
-            </w:tcBorders>
-            <w:tcMar>
-              <w:top w:w="100.0" w:type="dxa"/>
-              <w:left w:w="100.0" w:type="dxa"/>
-              <w:bottom w:w="100.0" w:type="dxa"/>
-              <w:right w:w="100.0" w:type="dxa"/>
-            </w:tcMar>
-            <w:vAlign w:val="top"/>
-          </w:tcPr>
-          <w:p>
-            <w:pPr>
-              <w:spacing w:after="240" w:before="240" w:lineRule="auto"/>
-              <w:rPr/>
-            </w:pPr>
-            <w:r>
-              <w:rPr>
-                <w:rtl w:val="0"/>
-              </w:rPr>
-              <w:t xml:space="preserve">Escala 1 a 5</w:t>
-            </w:r>
-          </w:p>
-        </w:tc>
-        <w:tc>
-          <w:tcPr>
-            <w:tcBorders>
-              <w:top w:color="000000" w:space="0" w:sz="0" w:val="nil"/>
-              <w:left w:color="000000" w:space="0" w:sz="0" w:val="nil"/>
-              <w:bottom w:color="000000" w:space="0" w:sz="0" w:val="nil"/>
-              <w:right w:color="000000" w:space="0" w:sz="0" w:val="nil"/>
-            </w:tcBorders>
-            <w:tcMar>
-              <w:top w:w="100.0" w:type="dxa"/>
-              <w:left w:w="100.0" w:type="dxa"/>
-              <w:bottom w:w="100.0" w:type="dxa"/>
-              <w:right w:w="100.0" w:type="dxa"/>
-            </w:tcMar>
-            <w:vAlign w:val="top"/>
-          </w:tcPr>
-          <w:p>
-            <w:pPr>
-              <w:spacing w:after="240" w:before="240" w:lineRule="auto"/>
-              <w:rPr/>
-            </w:pPr>
-            <w:r>
-              <w:rPr>
-                <w:rtl w:val="0"/>
-              </w:rPr>
-              <w:t xml:space="preserve">P1, F10</w:t>
-            </w:r>
-          </w:p>
-        </w:tc>
-      </w:tr>
-      <w:tr>
-        <w:trPr>
-          <w:cantSplit w:val="0"/>
           <w:trHeight w:val="770" w:hRule="atLeast"/>
           <w:tblHeader w:val="0"/>
         </w:trPr>
@@ -13998,6 +14000,26 @@
       </w:pPr>
       <w:r>
         <w:rPr>
+          <w:b w:val="1"/>
+          <w:bCs w:val="1"/>
+          <w:rtl w:val="0"/>
+        </w:rPr>
+        <w:t xml:space="preserve">Funciones adicionales:</w:t>
+      </w:r>
+      <w:r>
+        <w:rPr>
+          <w:rtl w:val="0"/>
+        </w:rPr>
+        <w:t xml:space="preserve"> un comparador de destinos, que pone frente a frente 2 o 3 países marcados en el resultado (compatibilidad, coste diario, horas de vuelo, seguridad, requisitos de entrada, restricciones incumplidas, afinidad en los 8 criterios y clima del mes), y un simulador de sensibilidad, que permite mover el presupuesto, el límite de vuelo, el mes y el peso de cada criterio (de 0 a 5) y recalcula el resultado al momento.</w:t>
+      </w:r>
+    </w:p>
+    <w:p>
+      <w:pPr>
+        <w:spacing w:after="240" w:before="240" w:lineRule="auto"/>
+        <w:rPr/>
+      </w:pPr>
+      <w:r>
+        <w:rPr>
           <w:rtl w:val="0"/>
         </w:rPr>
         <w:t xml:space="preserve">[Pendiente de completar con la aplicación publicada: capturas de la pantalla de pregunta, del resultado, de "Por qué" y de la lista de descartados.]</w:t>
@@ -14038,7 +14060,7 @@
         <w:rPr>
           <w:rtl w:val="0"/>
         </w:rPr>
-        <w:t xml:space="preserve">Se definen 15 casos reproducibles, ejecutables en la ruta </w:t>
+        <w:t xml:space="preserve">Se definen 15 casos reproducibles más el caso 11b, ejecutables en la ruta </w:t>
       </w:r>
       <w:r>
         <w:rPr>
@@ -14052,13 +14074,13 @@
         <w:rPr>
           <w:rtl w:val="0"/>
         </w:rPr>
-        <w:t xml:space="preserve"> de la aplicación. Las columnas "Obtenido" y "Evidencia" se rellenan al ejecutarlos sobre la versión publicada.</w:t>
+        <w:t xml:space="preserve"> de la aplicación. La columna "Obtenido" recoge la ejecución del 2026-10-23 sobre public/knowledge.json: 16 de 16 superadas. La columna "Evidencia" se completa con la captura de #/tests en la versión publicada.</w:t>
       </w:r>
     </w:p>
     <w:tbl>
       <w:tblPr>
         <w:tblStyle w:val="Table7"/>
-        <w:tblW w:w="9025.511811023624" w:type="dxa"/>
+        <w:tblW w:w="9025" w:type="dxa"/>
         <w:jc w:val="left"/>
         <w:tblBorders>
           <w:top w:color="000000" w:space="0" w:sz="0" w:val="nil"/>
@@ -14072,18 +14094,18 @@
         <w:tblLook w:val="0600"/>
       </w:tblPr>
       <w:tblGrid>
-        <w:gridCol w:w="853.388578226283"/>
-        <w:gridCol w:w="2216.9551108269743"/>
-        <w:gridCol w:w="3691.8331971093544"/>
-        <w:gridCol w:w="1103.8395740100834"/>
-        <w:gridCol w:w="1159.495350850928"/>
+        <w:gridCol w:w="700"/>
+        <w:gridCol w:w="1900"/>
+        <w:gridCol w:w="2800"/>
+        <w:gridCol w:w="2700"/>
+        <w:gridCol w:w="925"/>
         <w:tblGridChange w:id="0">
           <w:tblGrid>
-            <w:gridCol w:w="853.388578226283"/>
-            <w:gridCol w:w="2216.9551108269743"/>
-            <w:gridCol w:w="3691.8331971093544"/>
-            <w:gridCol w:w="1103.8395740100834"/>
-            <w:gridCol w:w="1159.495350850928"/>
+            <w:gridCol w:w="700"/>
+            <w:gridCol w:w="1900"/>
+            <w:gridCol w:w="2800"/>
+            <w:gridCol w:w="2700"/>
+            <w:gridCol w:w="925"/>
           </w:tblGrid>
         </w:tblGridChange>
       </w:tblGrid>
@@ -14358,36 +14380,36 @@
               <w:rPr>
                 <w:rtl w:val="0"/>
               </w:rPr>
-              <w:t xml:space="preserve">Ningún país con coste diario &gt; 40 sigue vivo (F1)</w:t>
-            </w:r>
-          </w:p>
-        </w:tc>
-        <w:tc>
-          <w:tcPr>
-            <w:tcBorders>
-              <w:top w:color="000000" w:space="0" w:sz="0" w:val="nil"/>
-              <w:left w:color="000000" w:space="0" w:sz="0" w:val="nil"/>
-              <w:bottom w:color="000000" w:space="0" w:sz="0" w:val="nil"/>
-              <w:right w:color="000000" w:space="0" w:sz="0" w:val="nil"/>
-            </w:tcBorders>
-            <w:tcMar>
-              <w:top w:w="100.0" w:type="dxa"/>
-              <w:left w:w="100.0" w:type="dxa"/>
-              <w:bottom w:w="100.0" w:type="dxa"/>
-              <w:right w:w="100.0" w:type="dxa"/>
-            </w:tcMar>
-            <w:vAlign w:val="top"/>
-          </w:tcPr>
-          <w:p>
-            <w:pPr>
-              <w:spacing w:after="240" w:before="240" w:lineRule="auto"/>
-              <w:rPr/>
-            </w:pPr>
-            <w:r>
-              <w:rPr>
-                <w:rtl w:val="0"/>
-              </w:rPr>
-              <w:t xml:space="preserve">pendiente</w:t>
+              <w:t xml:space="preserve">Ningún país con coste diario &gt; 40 € cumple todos los filtros (F1)</w:t>
+            </w:r>
+          </w:p>
+        </w:tc>
+        <w:tc>
+          <w:tcPr>
+            <w:tcBorders>
+              <w:top w:color="000000" w:space="0" w:sz="0" w:val="nil"/>
+              <w:left w:color="000000" w:space="0" w:sz="0" w:val="nil"/>
+              <w:bottom w:color="000000" w:space="0" w:sz="0" w:val="nil"/>
+              <w:right w:color="000000" w:space="0" w:sz="0" w:val="nil"/>
+            </w:tcBorders>
+            <w:tcMar>
+              <w:top w:w="100.0" w:type="dxa"/>
+              <w:left w:w="100.0" w:type="dxa"/>
+              <w:bottom w:w="100.0" w:type="dxa"/>
+              <w:right w:w="100.0" w:type="dxa"/>
+            </w:tcMar>
+            <w:vAlign w:val="top"/>
+          </w:tcPr>
+          <w:p>
+            <w:pPr>
+              <w:spacing w:after="240" w:before="240" w:lineRule="auto"/>
+              <w:rPr/>
+            </w:pPr>
+            <w:r>
+              <w:rPr>
+                <w:rtl w:val="0"/>
+              </w:rPr>
+              <w:t xml:space="preserve">Superada: 3 países cumplen, todos con 40 € o menos</w:t>
             </w:r>
           </w:p>
         </w:tc>
@@ -14508,36 +14530,36 @@
               <w:rPr>
                 <w:rtl w:val="0"/>
               </w:rPr>
-              <w:t xml:space="preserve">Solo países con vuelo &lt;= 3 h (F2)</w:t>
-            </w:r>
-          </w:p>
-        </w:tc>
-        <w:tc>
-          <w:tcPr>
-            <w:tcBorders>
-              <w:top w:color="000000" w:space="0" w:sz="0" w:val="nil"/>
-              <w:left w:color="000000" w:space="0" w:sz="0" w:val="nil"/>
-              <w:bottom w:color="000000" w:space="0" w:sz="0" w:val="nil"/>
-              <w:right w:color="000000" w:space="0" w:sz="0" w:val="nil"/>
-            </w:tcBorders>
-            <w:tcMar>
-              <w:top w:w="100.0" w:type="dxa"/>
-              <w:left w:w="100.0" w:type="dxa"/>
-              <w:bottom w:w="100.0" w:type="dxa"/>
-              <w:right w:w="100.0" w:type="dxa"/>
-            </w:tcMar>
-            <w:vAlign w:val="top"/>
-          </w:tcPr>
-          <w:p>
-            <w:pPr>
-              <w:spacing w:after="240" w:before="240" w:lineRule="auto"/>
-              <w:rPr/>
-            </w:pPr>
-            <w:r>
-              <w:rPr>
-                <w:rtl w:val="0"/>
-              </w:rPr>
-              <w:t xml:space="preserve">pendiente</w:t>
+              <w:t xml:space="preserve">Solo quedan países con vuelo &lt;= 3 h (F2)</w:t>
+            </w:r>
+          </w:p>
+        </w:tc>
+        <w:tc>
+          <w:tcPr>
+            <w:tcBorders>
+              <w:top w:color="000000" w:space="0" w:sz="0" w:val="nil"/>
+              <w:left w:color="000000" w:space="0" w:sz="0" w:val="nil"/>
+              <w:bottom w:color="000000" w:space="0" w:sz="0" w:val="nil"/>
+              <w:right w:color="000000" w:space="0" w:sz="0" w:val="nil"/>
+            </w:tcBorders>
+            <w:tcMar>
+              <w:top w:w="100.0" w:type="dxa"/>
+              <w:left w:w="100.0" w:type="dxa"/>
+              <w:bottom w:w="100.0" w:type="dxa"/>
+              <w:right w:w="100.0" w:type="dxa"/>
+            </w:tcMar>
+            <w:vAlign w:val="top"/>
+          </w:tcPr>
+          <w:p>
+            <w:pPr>
+              <w:spacing w:after="240" w:before="240" w:lineRule="auto"/>
+              <w:rPr/>
+            </w:pPr>
+            <w:r>
+              <w:rPr>
+                <w:rtl w:val="0"/>
+              </w:rPr>
+              <w:t xml:space="preserve">Superada: quedan 8 países, todos con 3 h o menos</w:t>
             </w:r>
           </w:p>
         </w:tc>
@@ -14687,7 +14709,7 @@
               <w:rPr>
                 <w:rtl w:val="0"/>
               </w:rPr>
-              <w:t xml:space="preserve">pendiente</w:t>
+              <w:t xml:space="preserve">Superada: quedan 27 países, todos sin trámite previo</w:t>
             </w:r>
           </w:p>
         </w:tc>
@@ -14837,7 +14859,7 @@
               <w:rPr>
                 <w:rtl w:val="0"/>
               </w:rPr>
-              <w:t xml:space="preserve">pendiente</w:t>
+              <w:t xml:space="preserve">Superada: quedan 31 países sin recomendaciones relevantes</w:t>
             </w:r>
           </w:p>
         </w:tc>
@@ -14987,7 +15009,7 @@
               <w:rPr>
                 <w:rtl w:val="0"/>
               </w:rPr>
-              <w:t xml:space="preserve">pendiente</w:t>
+              <w:t xml:space="preserve">Superada: quedan 32 países, ninguno de riesgo alto</w:t>
             </w:r>
           </w:p>
         </w:tc>
@@ -15137,7 +15159,7 @@
               <w:rPr>
                 <w:rtl w:val="0"/>
               </w:rPr>
-              <w:t xml:space="preserve">pendiente</w:t>
+              <w:t xml:space="preserve">Superada: quedan 13 países de Bajo riesgo</w:t>
             </w:r>
           </w:p>
         </w:tc>
@@ -15229,65 +15251,65 @@
               <w:rPr>
                 <w:rtl w:val="0"/>
               </w:rPr>
-              <w:t xml:space="preserve">Enero, clima cálido y peso de clima 3</w:t>
-            </w:r>
-          </w:p>
-        </w:tc>
-        <w:tc>
-          <w:tcPr>
-            <w:tcBorders>
-              <w:top w:color="000000" w:space="0" w:sz="0" w:val="nil"/>
-              <w:left w:color="000000" w:space="0" w:sz="0" w:val="nil"/>
-              <w:bottom w:color="000000" w:space="0" w:sz="0" w:val="nil"/>
-              <w:right w:color="000000" w:space="0" w:sz="0" w:val="nil"/>
-            </w:tcBorders>
-            <w:tcMar>
-              <w:top w:w="100.0" w:type="dxa"/>
-              <w:left w:w="100.0" w:type="dxa"/>
-              <w:bottom w:w="100.0" w:type="dxa"/>
-              <w:right w:w="100.0" w:type="dxa"/>
-            </w:tcMar>
-            <w:vAlign w:val="top"/>
-          </w:tcPr>
-          <w:p>
-            <w:pPr>
-              <w:spacing w:after="240" w:before="240" w:lineRule="auto"/>
-              <w:rPr/>
-            </w:pPr>
-            <w:r>
-              <w:rPr>
-                <w:rtl w:val="0"/>
-              </w:rPr>
-              <w:t xml:space="preserve">Ningún país se descarta por clima; Tailandia (24,1 °C) tiene afinidad de clima 5 y Emiratos Árabes Unidos (18,5 °C) tiene 3 (P2)</w:t>
-            </w:r>
-          </w:p>
-        </w:tc>
-        <w:tc>
-          <w:tcPr>
-            <w:tcBorders>
-              <w:top w:color="000000" w:space="0" w:sz="0" w:val="nil"/>
-              <w:left w:color="000000" w:space="0" w:sz="0" w:val="nil"/>
-              <w:bottom w:color="000000" w:space="0" w:sz="0" w:val="nil"/>
-              <w:right w:color="000000" w:space="0" w:sz="0" w:val="nil"/>
-            </w:tcBorders>
-            <w:tcMar>
-              <w:top w:w="100.0" w:type="dxa"/>
-              <w:left w:w="100.0" w:type="dxa"/>
-              <w:bottom w:w="100.0" w:type="dxa"/>
-              <w:right w:w="100.0" w:type="dxa"/>
-            </w:tcMar>
-            <w:vAlign w:val="top"/>
-          </w:tcPr>
-          <w:p>
-            <w:pPr>
-              <w:spacing w:after="240" w:before="240" w:lineRule="auto"/>
-              <w:rPr/>
-            </w:pPr>
-            <w:r>
-              <w:rPr>
-                <w:rtl w:val="0"/>
-              </w:rPr>
-              <w:t xml:space="preserve">pendiente</w:t>
+              <w:t xml:space="preserve">Enero, clima cálido y peso de clima 5</w:t>
+            </w:r>
+          </w:p>
+        </w:tc>
+        <w:tc>
+          <w:tcPr>
+            <w:tcBorders>
+              <w:top w:color="000000" w:space="0" w:sz="0" w:val="nil"/>
+              <w:left w:color="000000" w:space="0" w:sz="0" w:val="nil"/>
+              <w:bottom w:color="000000" w:space="0" w:sz="0" w:val="nil"/>
+              <w:right w:color="000000" w:space="0" w:sz="0" w:val="nil"/>
+            </w:tcBorders>
+            <w:tcMar>
+              <w:top w:w="100.0" w:type="dxa"/>
+              <w:left w:w="100.0" w:type="dxa"/>
+              <w:bottom w:w="100.0" w:type="dxa"/>
+              <w:right w:w="100.0" w:type="dxa"/>
+            </w:tcMar>
+            <w:vAlign w:val="top"/>
+          </w:tcPr>
+          <w:p>
+            <w:pPr>
+              <w:spacing w:after="240" w:before="240" w:lineRule="auto"/>
+              <w:rPr/>
+            </w:pPr>
+            <w:r>
+              <w:rPr>
+                <w:rtl w:val="0"/>
+              </w:rPr>
+              <w:t xml:space="preserve">Solo cumplen países con afinidad de clima &gt;= 4 (F10)</w:t>
+            </w:r>
+          </w:p>
+        </w:tc>
+        <w:tc>
+          <w:tcPr>
+            <w:tcBorders>
+              <w:top w:color="000000" w:space="0" w:sz="0" w:val="nil"/>
+              <w:left w:color="000000" w:space="0" w:sz="0" w:val="nil"/>
+              <w:bottom w:color="000000" w:space="0" w:sz="0" w:val="nil"/>
+              <w:right w:color="000000" w:space="0" w:sz="0" w:val="nil"/>
+            </w:tcBorders>
+            <w:tcMar>
+              <w:top w:w="100.0" w:type="dxa"/>
+              <w:left w:w="100.0" w:type="dxa"/>
+              <w:bottom w:w="100.0" w:type="dxa"/>
+              <w:right w:w="100.0" w:type="dxa"/>
+            </w:tcMar>
+            <w:vAlign w:val="top"/>
+          </w:tcPr>
+          <w:p>
+            <w:pPr>
+              <w:spacing w:after="240" w:before="240" w:lineRule="auto"/>
+              <w:rPr/>
+            </w:pPr>
+            <w:r>
+              <w:rPr>
+                <w:rtl w:val="0"/>
+              </w:rPr>
+              <w:t xml:space="preserve">Superada: quedan 16 países con afinidad de clima 4 o más</w:t>
             </w:r>
           </w:p>
         </w:tc>
@@ -15379,65 +15401,65 @@
               <w:rPr>
                 <w:rtl w:val="0"/>
               </w:rPr>
-              <w:t xml:space="preserve">Julio, clima cálido, le molesta la lluvia y peso de clima 3</w:t>
-            </w:r>
-          </w:p>
-        </w:tc>
-        <w:tc>
-          <w:tcPr>
-            <w:tcBorders>
-              <w:top w:color="000000" w:space="0" w:sz="0" w:val="nil"/>
-              <w:left w:color="000000" w:space="0" w:sz="0" w:val="nil"/>
-              <w:bottom w:color="000000" w:space="0" w:sz="0" w:val="nil"/>
-              <w:right w:color="000000" w:space="0" w:sz="0" w:val="nil"/>
-            </w:tcBorders>
-            <w:tcMar>
-              <w:top w:w="100.0" w:type="dxa"/>
-              <w:left w:w="100.0" w:type="dxa"/>
-              <w:bottom w:w="100.0" w:type="dxa"/>
-              <w:right w:w="100.0" w:type="dxa"/>
-            </w:tcMar>
-            <w:vAlign w:val="top"/>
-          </w:tcPr>
-          <w:p>
-            <w:pPr>
-              <w:spacing w:after="240" w:before="240" w:lineRule="auto"/>
-              <w:rPr/>
-            </w:pPr>
-            <w:r>
-              <w:rPr>
-                <w:rtl w:val="0"/>
-              </w:rPr>
-              <w:t xml:space="preserve">Tailandia (221 mm en julio) tiene afinidad de clima 4: 5 menos 1 por lluvia (P2)</w:t>
-            </w:r>
-          </w:p>
-        </w:tc>
-        <w:tc>
-          <w:tcPr>
-            <w:tcBorders>
-              <w:top w:color="000000" w:space="0" w:sz="0" w:val="nil"/>
-              <w:left w:color="000000" w:space="0" w:sz="0" w:val="nil"/>
-              <w:bottom w:color="000000" w:space="0" w:sz="0" w:val="nil"/>
-              <w:right w:color="000000" w:space="0" w:sz="0" w:val="nil"/>
-            </w:tcBorders>
-            <w:tcMar>
-              <w:top w:w="100.0" w:type="dxa"/>
-              <w:left w:w="100.0" w:type="dxa"/>
-              <w:bottom w:w="100.0" w:type="dxa"/>
-              <w:right w:w="100.0" w:type="dxa"/>
-            </w:tcMar>
-            <w:vAlign w:val="top"/>
-          </w:tcPr>
-          <w:p>
-            <w:pPr>
-              <w:spacing w:after="240" w:before="240" w:lineRule="auto"/>
-              <w:rPr/>
-            </w:pPr>
-            <w:r>
-              <w:rPr>
-                <w:rtl w:val="0"/>
-              </w:rPr>
-              <w:t xml:space="preserve">pendiente</w:t>
+              <w:t xml:space="preserve">India en julio, clima cálido, con y sin tolerancia a la lluvia</w:t>
+            </w:r>
+          </w:p>
+        </w:tc>
+        <w:tc>
+          <w:tcPr>
+            <w:tcBorders>
+              <w:top w:color="000000" w:space="0" w:sz="0" w:val="nil"/>
+              <w:left w:color="000000" w:space="0" w:sz="0" w:val="nil"/>
+              <w:bottom w:color="000000" w:space="0" w:sz="0" w:val="nil"/>
+              <w:right w:color="000000" w:space="0" w:sz="0" w:val="nil"/>
+            </w:tcBorders>
+            <w:tcMar>
+              <w:top w:w="100.0" w:type="dxa"/>
+              <w:left w:w="100.0" w:type="dxa"/>
+              <w:bottom w:w="100.0" w:type="dxa"/>
+              <w:right w:w="100.0" w:type="dxa"/>
+            </w:tcMar>
+            <w:vAlign w:val="top"/>
+          </w:tcPr>
+          <w:p>
+            <w:pPr>
+              <w:spacing w:after="240" w:before="240" w:lineRule="auto"/>
+              <w:rPr/>
+            </w:pPr>
+            <w:r>
+              <w:rPr>
+                <w:rtl w:val="0"/>
+              </w:rPr>
+              <w:t xml:space="preserve">Sin tolerancia, la afinidad de clima baja 1 punto si llueven más de 150 mm (P2)</w:t>
+            </w:r>
+          </w:p>
+        </w:tc>
+        <w:tc>
+          <w:tcPr>
+            <w:tcBorders>
+              <w:top w:color="000000" w:space="0" w:sz="0" w:val="nil"/>
+              <w:left w:color="000000" w:space="0" w:sz="0" w:val="nil"/>
+              <w:bottom w:color="000000" w:space="0" w:sz="0" w:val="nil"/>
+              <w:right w:color="000000" w:space="0" w:sz="0" w:val="nil"/>
+            </w:tcBorders>
+            <w:tcMar>
+              <w:top w:w="100.0" w:type="dxa"/>
+              <w:left w:w="100.0" w:type="dxa"/>
+              <w:bottom w:w="100.0" w:type="dxa"/>
+              <w:right w:w="100.0" w:type="dxa"/>
+            </w:tcMar>
+            <w:vAlign w:val="top"/>
+          </w:tcPr>
+          <w:p>
+            <w:pPr>
+              <w:spacing w:after="240" w:before="240" w:lineRule="auto"/>
+              <w:rPr/>
+            </w:pPr>
+            <w:r>
+              <w:rPr>
+                <w:rtl w:val="0"/>
+              </w:rPr>
+              <w:t xml:space="preserve">Superada: la afinidad baja de 5 a 4</w:t>
             </w:r>
           </w:p>
         </w:tc>
@@ -15587,7 +15609,7 @@
               <w:rPr>
                 <w:rtl w:val="0"/>
               </w:rPr>
-              <w:t xml:space="preserve">pendiente</w:t>
+              <w:t xml:space="preserve">Superada: quedan 27 países con afinidad 4 o 5</w:t>
             </w:r>
           </w:p>
         </w:tc>
@@ -15737,7 +15759,7 @@
               <w:rPr>
                 <w:rtl w:val="0"/>
               </w:rPr>
-              <w:t xml:space="preserve">pendiente</w:t>
+              <w:t xml:space="preserve">Superada: ningún país tiene compatibilidad y se avisa del orden alfabético</w:t>
             </w:r>
           </w:p>
         </w:tc>
@@ -15858,36 +15880,186 @@
               <w:rPr>
                 <w:rtl w:val="0"/>
               </w:rPr>
-              <w:t xml:space="preserve">Sin pantalla vacía: aparece "Casi cumplen" con las reglas incumplidas y el aviso M1</w:t>
-            </w:r>
-          </w:p>
-        </w:tc>
-        <w:tc>
-          <w:tcPr>
-            <w:tcBorders>
-              <w:top w:color="000000" w:space="0" w:sz="0" w:val="nil"/>
-              <w:left w:color="000000" w:space="0" w:sz="0" w:val="nil"/>
-              <w:bottom w:color="000000" w:space="0" w:sz="0" w:val="nil"/>
-              <w:right w:color="000000" w:space="0" w:sz="0" w:val="nil"/>
-            </w:tcBorders>
-            <w:tcMar>
-              <w:top w:w="100.0" w:type="dxa"/>
-              <w:left w:w="100.0" w:type="dxa"/>
-              <w:bottom w:w="100.0" w:type="dxa"/>
-              <w:right w:w="100.0" w:type="dxa"/>
-            </w:tcMar>
-            <w:vAlign w:val="top"/>
-          </w:tcPr>
-          <w:p>
-            <w:pPr>
-              <w:spacing w:after="240" w:before="240" w:lineRule="auto"/>
-              <w:rPr/>
-            </w:pPr>
-            <w:r>
-              <w:rPr>
-                <w:rtl w:val="0"/>
-              </w:rPr>
-              <w:t xml:space="preserve">pendiente</w:t>
+              <w:t xml:space="preserve">Sin pantalla vacía: aparecen "Los que más se ajustan" con las reglas incumplidas y su margen, y el aviso M1 porque el mejor no llega al 70 % (M2)</w:t>
+            </w:r>
+          </w:p>
+        </w:tc>
+        <w:tc>
+          <w:tcPr>
+            <w:tcBorders>
+              <w:top w:color="000000" w:space="0" w:sz="0" w:val="nil"/>
+              <w:left w:color="000000" w:space="0" w:sz="0" w:val="nil"/>
+              <w:bottom w:color="000000" w:space="0" w:sz="0" w:val="nil"/>
+              <w:right w:color="000000" w:space="0" w:sz="0" w:val="nil"/>
+            </w:tcBorders>
+            <w:tcMar>
+              <w:top w:w="100.0" w:type="dxa"/>
+              <w:left w:w="100.0" w:type="dxa"/>
+              <w:bottom w:w="100.0" w:type="dxa"/>
+              <w:right w:w="100.0" w:type="dxa"/>
+            </w:tcMar>
+            <w:vAlign w:val="top"/>
+          </w:tcPr>
+          <w:p>
+            <w:pPr>
+              <w:spacing w:after="240" w:before="240" w:lineRule="auto"/>
+              <w:rPr/>
+            </w:pPr>
+            <w:r>
+              <w:rPr>
+                <w:rtl w:val="0"/>
+              </w:rPr>
+              <w:t xml:space="preserve">Superada: 3 países con márgenes y aviso M1 activo</w:t>
+            </w:r>
+          </w:p>
+        </w:tc>
+        <w:tc>
+          <w:tcPr>
+            <w:tcBorders>
+              <w:top w:color="000000" w:space="0" w:sz="0" w:val="nil"/>
+              <w:left w:color="000000" w:space="0" w:sz="0" w:val="nil"/>
+              <w:bottom w:color="000000" w:space="0" w:sz="0" w:val="nil"/>
+              <w:right w:color="000000" w:space="0" w:sz="0" w:val="nil"/>
+            </w:tcBorders>
+            <w:tcMar>
+              <w:top w:w="100.0" w:type="dxa"/>
+              <w:left w:w="100.0" w:type="dxa"/>
+              <w:bottom w:w="100.0" w:type="dxa"/>
+              <w:right w:w="100.0" w:type="dxa"/>
+            </w:tcMar>
+            <w:vAlign w:val="top"/>
+          </w:tcPr>
+          <w:p>
+            <w:pPr>
+              <w:rPr/>
+            </w:pPr>
+            <w:r>
+              <w:rPr>
+                <w:rtl w:val="0"/>
+              </w:rPr>
+            </w:r>
+          </w:p>
+        </w:tc>
+      </w:tr>
+      <w:tr>
+        <w:trPr>
+          <w:cantSplit w:val="0"/>
+          <w:trHeight w:val="1040" w:hRule="atLeast"/>
+          <w:tblHeader w:val="0"/>
+        </w:trPr>
+        <w:tc>
+          <w:tcPr>
+            <w:tcBorders>
+              <w:top w:color="000000" w:space="0" w:sz="0" w:val="nil"/>
+              <w:left w:color="000000" w:space="0" w:sz="0" w:val="nil"/>
+              <w:bottom w:color="000000" w:space="0" w:sz="0" w:val="nil"/>
+              <w:right w:color="000000" w:space="0" w:sz="0" w:val="nil"/>
+            </w:tcBorders>
+            <w:tcMar>
+              <w:top w:w="100.0" w:type="dxa"/>
+              <w:left w:w="100.0" w:type="dxa"/>
+              <w:bottom w:w="100.0" w:type="dxa"/>
+              <w:right w:w="100.0" w:type="dxa"/>
+            </w:tcMar>
+            <w:vAlign w:val="top"/>
+          </w:tcPr>
+          <w:p>
+            <w:pPr>
+              <w:spacing w:after="240" w:before="240" w:lineRule="auto"/>
+              <w:rPr/>
+            </w:pPr>
+            <w:r>
+              <w:rPr>
+                <w:rtl w:val="0"/>
+              </w:rPr>
+              <w:t xml:space="preserve">11b</w:t>
+            </w:r>
+          </w:p>
+        </w:tc>
+        <w:tc>
+          <w:tcPr>
+            <w:tcBorders>
+              <w:top w:color="000000" w:space="0" w:sz="0" w:val="nil"/>
+              <w:left w:color="000000" w:space="0" w:sz="0" w:val="nil"/>
+              <w:bottom w:color="000000" w:space="0" w:sz="0" w:val="nil"/>
+              <w:right w:color="000000" w:space="0" w:sz="0" w:val="nil"/>
+            </w:tcBorders>
+            <w:tcMar>
+              <w:top w:w="100.0" w:type="dxa"/>
+              <w:left w:w="100.0" w:type="dxa"/>
+              <w:bottom w:w="100.0" w:type="dxa"/>
+              <w:right w:w="100.0" w:type="dxa"/>
+            </w:tcMar>
+            <w:vAlign w:val="top"/>
+          </w:tcPr>
+          <w:p>
+            <w:pPr>
+              <w:spacing w:after="240" w:before="240" w:lineRule="auto"/>
+              <w:rPr/>
+            </w:pPr>
+            <w:r>
+              <w:rPr>
+                <w:rtl w:val="0"/>
+              </w:rPr>
+              <w:t xml:space="preserve">Presupuesto 10 €/día, peso de playa 5 y peso de seguridad 5</w:t>
+            </w:r>
+          </w:p>
+        </w:tc>
+        <w:tc>
+          <w:tcPr>
+            <w:tcBorders>
+              <w:top w:color="000000" w:space="0" w:sz="0" w:val="nil"/>
+              <w:left w:color="000000" w:space="0" w:sz="0" w:val="nil"/>
+              <w:bottom w:color="000000" w:space="0" w:sz="0" w:val="nil"/>
+              <w:right w:color="000000" w:space="0" w:sz="0" w:val="nil"/>
+            </w:tcBorders>
+            <w:tcMar>
+              <w:top w:w="100.0" w:type="dxa"/>
+              <w:left w:w="100.0" w:type="dxa"/>
+              <w:bottom w:w="100.0" w:type="dxa"/>
+              <w:right w:w="100.0" w:type="dxa"/>
+            </w:tcMar>
+            <w:vAlign w:val="top"/>
+          </w:tcPr>
+          <w:p>
+            <w:pPr>
+              <w:spacing w:after="240" w:before="240" w:lineRule="auto"/>
+              <w:rPr/>
+            </w:pPr>
+            <w:r>
+              <w:rPr>
+                <w:rtl w:val="0"/>
+              </w:rPr>
+              <w:t xml:space="preserve">Ningún país cumple todo, pero el mejor llega al 70 % o más: "Los que más se ajustan" sin aviso M1</w:t>
+            </w:r>
+          </w:p>
+        </w:tc>
+        <w:tc>
+          <w:tcPr>
+            <w:tcBorders>
+              <w:top w:color="000000" w:space="0" w:sz="0" w:val="nil"/>
+              <w:left w:color="000000" w:space="0" w:sz="0" w:val="nil"/>
+              <w:bottom w:color="000000" w:space="0" w:sz="0" w:val="nil"/>
+              <w:right w:color="000000" w:space="0" w:sz="0" w:val="nil"/>
+            </w:tcBorders>
+            <w:tcMar>
+              <w:top w:w="100.0" w:type="dxa"/>
+              <w:left w:w="100.0" w:type="dxa"/>
+              <w:bottom w:w="100.0" w:type="dxa"/>
+              <w:right w:w="100.0" w:type="dxa"/>
+            </w:tcMar>
+            <w:vAlign w:val="top"/>
+          </w:tcPr>
+          <w:p>
+            <w:pPr>
+              <w:spacing w:after="240" w:before="240" w:lineRule="auto"/>
+              <w:rPr/>
+            </w:pPr>
+            <w:r>
+              <w:rPr>
+                <w:rtl w:val="0"/>
+              </w:rPr>
+              <w:t xml:space="preserve">Superada: mejor compatibilidad del 100 % y sin aviso M1</w:t>
             </w:r>
           </w:p>
         </w:tc>
@@ -15979,65 +16151,65 @@
               <w:rPr>
                 <w:rtl w:val="0"/>
               </w:rPr>
-              <w:t xml:space="preserve">Dos países con igual compatibilidad</w:t>
-            </w:r>
-          </w:p>
-        </w:tc>
-        <w:tc>
-          <w:tcPr>
-            <w:tcBorders>
-              <w:top w:color="000000" w:space="0" w:sz="0" w:val="nil"/>
-              <w:left w:color="000000" w:space="0" w:sz="0" w:val="nil"/>
-              <w:bottom w:color="000000" w:space="0" w:sz="0" w:val="nil"/>
-              <w:right w:color="000000" w:space="0" w:sz="0" w:val="nil"/>
-            </w:tcBorders>
-            <w:tcMar>
-              <w:top w:w="100.0" w:type="dxa"/>
-              <w:left w:w="100.0" w:type="dxa"/>
-              <w:bottom w:w="100.0" w:type="dxa"/>
-              <w:right w:w="100.0" w:type="dxa"/>
-            </w:tcMar>
-            <w:vAlign w:val="top"/>
-          </w:tcPr>
-          <w:p>
-            <w:pPr>
-              <w:spacing w:after="240" w:before="240" w:lineRule="auto"/>
-              <w:rPr/>
-            </w:pPr>
-            <w:r>
-              <w:rPr>
-                <w:rtl w:val="0"/>
-              </w:rPr>
-              <w:t xml:space="preserve">Orden por criterios 4-5 y luego coste (M3)</w:t>
-            </w:r>
-          </w:p>
-        </w:tc>
-        <w:tc>
-          <w:tcPr>
-            <w:tcBorders>
-              <w:top w:color="000000" w:space="0" w:sz="0" w:val="nil"/>
-              <w:left w:color="000000" w:space="0" w:sz="0" w:val="nil"/>
-              <w:bottom w:color="000000" w:space="0" w:sz="0" w:val="nil"/>
-              <w:right w:color="000000" w:space="0" w:sz="0" w:val="nil"/>
-            </w:tcBorders>
-            <w:tcMar>
-              <w:top w:w="100.0" w:type="dxa"/>
-              <w:left w:w="100.0" w:type="dxa"/>
-              <w:bottom w:w="100.0" w:type="dxa"/>
-              <w:right w:w="100.0" w:type="dxa"/>
-            </w:tcMar>
-            <w:vAlign w:val="top"/>
-          </w:tcPr>
-          <w:p>
-            <w:pPr>
-              <w:spacing w:after="240" w:before="240" w:lineRule="auto"/>
-              <w:rPr/>
-            </w:pPr>
-            <w:r>
-              <w:rPr>
-                <w:rtl w:val="0"/>
-              </w:rPr>
-              <w:t xml:space="preserve">pendiente</w:t>
+              <w:t xml:space="preserve">Peso de cultura 4</w:t>
+            </w:r>
+          </w:p>
+        </w:tc>
+        <w:tc>
+          <w:tcPr>
+            <w:tcBorders>
+              <w:top w:color="000000" w:space="0" w:sz="0" w:val="nil"/>
+              <w:left w:color="000000" w:space="0" w:sz="0" w:val="nil"/>
+              <w:bottom w:color="000000" w:space="0" w:sz="0" w:val="nil"/>
+              <w:right w:color="000000" w:space="0" w:sz="0" w:val="nil"/>
+            </w:tcBorders>
+            <w:tcMar>
+              <w:top w:w="100.0" w:type="dxa"/>
+              <w:left w:w="100.0" w:type="dxa"/>
+              <w:bottom w:w="100.0" w:type="dxa"/>
+              <w:right w:w="100.0" w:type="dxa"/>
+            </w:tcMar>
+            <w:vAlign w:val="top"/>
+          </w:tcPr>
+          <w:p>
+            <w:pPr>
+              <w:spacing w:after="240" w:before="240" w:lineRule="auto"/>
+              <w:rPr/>
+            </w:pPr>
+            <w:r>
+              <w:rPr>
+                <w:rtl w:val="0"/>
+              </w:rPr>
+              <w:t xml:space="preserve">A igual compatibilidad, orden por criterios con afinidad 4-5 y luego menor coste (M3)</w:t>
+            </w:r>
+          </w:p>
+        </w:tc>
+        <w:tc>
+          <w:tcPr>
+            <w:tcBorders>
+              <w:top w:color="000000" w:space="0" w:sz="0" w:val="nil"/>
+              <w:left w:color="000000" w:space="0" w:sz="0" w:val="nil"/>
+              <w:bottom w:color="000000" w:space="0" w:sz="0" w:val="nil"/>
+              <w:right w:color="000000" w:space="0" w:sz="0" w:val="nil"/>
+            </w:tcBorders>
+            <w:tcMar>
+              <w:top w:w="100.0" w:type="dxa"/>
+              <w:left w:w="100.0" w:type="dxa"/>
+              <w:bottom w:w="100.0" w:type="dxa"/>
+              <w:right w:w="100.0" w:type="dxa"/>
+            </w:tcMar>
+            <w:vAlign w:val="top"/>
+          </w:tcPr>
+          <w:p>
+            <w:pPr>
+              <w:spacing w:after="240" w:before="240" w:lineRule="auto"/>
+              <w:rPr/>
+            </w:pPr>
+            <w:r>
+              <w:rPr>
+                <w:rtl w:val="0"/>
+              </w:rPr>
+              <w:t xml:space="preserve">Superada: orden de desempate correcto</w:t>
             </w:r>
           </w:p>
         </w:tc>
@@ -16129,65 +16301,65 @@
               <w:rPr>
                 <w:rtl w:val="0"/>
               </w:rPr>
-              <w:t xml:space="preserve">País con SIN DATO (Túnez, coste)</w:t>
-            </w:r>
-          </w:p>
-        </w:tc>
-        <w:tc>
-          <w:tcPr>
-            <w:tcBorders>
-              <w:top w:color="000000" w:space="0" w:sz="0" w:val="nil"/>
-              <w:left w:color="000000" w:space="0" w:sz="0" w:val="nil"/>
-              <w:bottom w:color="000000" w:space="0" w:sz="0" w:val="nil"/>
-              <w:right w:color="000000" w:space="0" w:sz="0" w:val="nil"/>
-            </w:tcBorders>
-            <w:tcMar>
-              <w:top w:w="100.0" w:type="dxa"/>
-              <w:left w:w="100.0" w:type="dxa"/>
-              <w:bottom w:w="100.0" w:type="dxa"/>
-              <w:right w:w="100.0" w:type="dxa"/>
-            </w:tcMar>
-            <w:vAlign w:val="top"/>
-          </w:tcPr>
-          <w:p>
-            <w:pPr>
-              <w:spacing w:after="240" w:before="240" w:lineRule="auto"/>
-              <w:rPr/>
-            </w:pPr>
-            <w:r>
-              <w:rPr>
-                <w:rtl w:val="0"/>
-              </w:rPr>
-              <w:t xml:space="preserve">No se descarta por F1 y su afinidad de precio es 3 (D1)</w:t>
-            </w:r>
-          </w:p>
-        </w:tc>
-        <w:tc>
-          <w:tcPr>
-            <w:tcBorders>
-              <w:top w:color="000000" w:space="0" w:sz="0" w:val="nil"/>
-              <w:left w:color="000000" w:space="0" w:sz="0" w:val="nil"/>
-              <w:bottom w:color="000000" w:space="0" w:sz="0" w:val="nil"/>
-              <w:right w:color="000000" w:space="0" w:sz="0" w:val="nil"/>
-            </w:tcBorders>
-            <w:tcMar>
-              <w:top w:w="100.0" w:type="dxa"/>
-              <w:left w:w="100.0" w:type="dxa"/>
-              <w:bottom w:w="100.0" w:type="dxa"/>
-              <w:right w:w="100.0" w:type="dxa"/>
-            </w:tcMar>
-            <w:vAlign w:val="top"/>
-          </w:tcPr>
-          <w:p>
-            <w:pPr>
-              <w:spacing w:after="240" w:before="240" w:lineRule="auto"/>
-              <w:rPr/>
-            </w:pPr>
-            <w:r>
-              <w:rPr>
-                <w:rtl w:val="0"/>
-              </w:rPr>
-              <w:t xml:space="preserve">pendiente</w:t>
+              <w:t xml:space="preserve">Presupuesto 50 €/día y peso de precio 4</w:t>
+            </w:r>
+          </w:p>
+        </w:tc>
+        <w:tc>
+          <w:tcPr>
+            <w:tcBorders>
+              <w:top w:color="000000" w:space="0" w:sz="0" w:val="nil"/>
+              <w:left w:color="000000" w:space="0" w:sz="0" w:val="nil"/>
+              <w:bottom w:color="000000" w:space="0" w:sz="0" w:val="nil"/>
+              <w:right w:color="000000" w:space="0" w:sz="0" w:val="nil"/>
+            </w:tcBorders>
+            <w:tcMar>
+              <w:top w:w="100.0" w:type="dxa"/>
+              <w:left w:w="100.0" w:type="dxa"/>
+              <w:bottom w:w="100.0" w:type="dxa"/>
+              <w:right w:w="100.0" w:type="dxa"/>
+            </w:tcMar>
+            <w:vAlign w:val="top"/>
+          </w:tcPr>
+          <w:p>
+            <w:pPr>
+              <w:spacing w:after="240" w:before="240" w:lineRule="auto"/>
+              <w:rPr/>
+            </w:pPr>
+            <w:r>
+              <w:rPr>
+                <w:rtl w:val="0"/>
+              </w:rPr>
+              <w:t xml:space="preserve">Túnez (coste SIN DATO) no se descarta por F1 y su afinidad de precio es 3 (D1)</w:t>
+            </w:r>
+          </w:p>
+        </w:tc>
+        <w:tc>
+          <w:tcPr>
+            <w:tcBorders>
+              <w:top w:color="000000" w:space="0" w:sz="0" w:val="nil"/>
+              <w:left w:color="000000" w:space="0" w:sz="0" w:val="nil"/>
+              <w:bottom w:color="000000" w:space="0" w:sz="0" w:val="nil"/>
+              <w:right w:color="000000" w:space="0" w:sz="0" w:val="nil"/>
+            </w:tcBorders>
+            <w:tcMar>
+              <w:top w:w="100.0" w:type="dxa"/>
+              <w:left w:w="100.0" w:type="dxa"/>
+              <w:bottom w:w="100.0" w:type="dxa"/>
+              <w:right w:w="100.0" w:type="dxa"/>
+            </w:tcMar>
+            <w:vAlign w:val="top"/>
+          </w:tcPr>
+          <w:p>
+            <w:pPr>
+              <w:spacing w:after="240" w:before="240" w:lineRule="auto"/>
+              <w:rPr/>
+            </w:pPr>
+            <w:r>
+              <w:rPr>
+                <w:rtl w:val="0"/>
+              </w:rPr>
+              <w:t xml:space="preserve">Superada: Túnez no se descarta y su afinidad de precio es 3</w:t>
             </w:r>
           </w:p>
         </w:tc>
@@ -16337,7 +16509,7 @@
               <w:rPr>
                 <w:rtl w:val="0"/>
               </w:rPr>
-              <w:t xml:space="preserve">pendiente</w:t>
+              <w:t xml:space="preserve">Superada: aviso C1 "Pides mucha playa y clima fresco a la vez. Elige cuál pesa más."</w:t>
             </w:r>
           </w:p>
         </w:tc>
@@ -16429,7 +16601,7 @@
               <w:rPr>
                 <w:rtl w:val="0"/>
               </w:rPr>
-              <w:t xml:space="preserve">La misma entrada dos veces</w:t>
+              <w:t xml:space="preserve">La misma entrada completa (14 hechos) dos veces</w:t>
             </w:r>
           </w:p>
         </w:tc>
@@ -16487,7 +16659,7 @@
               <w:rPr>
                 <w:rtl w:val="0"/>
               </w:rPr>
-              <w:t xml:space="preserve">pendiente</w:t>
+              <w:t xml:space="preserve">Superada: mismos países, porcentajes y descartes</w:t>
             </w:r>
           </w:p>
         </w:tc>
@@ -16557,7 +16729,7 @@
         <w:rPr>
           <w:rtl w:val="0"/>
         </w:rPr>
-        <w:t xml:space="preserve"> Se probaron 8.000 perfiles de usuario aleatorios (presupuesto, días, mes, vuelo, clima y pesos al azar, con como mucho dos pesos a 5) contra la base de conocimiento. Con el clima como filtro eliminatorio, el 54 % de los perfiles se quedaba con 0 países. Con el clima como puntuación y la sección "Casi cumplen" (M1), ningún perfil se queda sin resultados y los mejores países incumplen como mucho una regla en el 99,6 % de los casos. Son perfiles inventados, no usuarios reales; sirven para detectar filtros demasiado duros, no para medir la satisfacción.</w:t>
+        <w:t xml:space="preserve"> Se probaron 8.000 perfiles de usuario aleatorios (presupuesto, días, mes, vuelo, clima y pesos al azar, con como mucho dos pesos a 5) contra la base de conocimiento. Con el clima como filtro eliminatorio, el 54 % de los perfiles se quedaba con 0 países. Con el clima como puntuación y la sección "Los que más se ajustan" (M1 y M2), ningún perfil se queda sin resultados y los mejores países incumplen como mucho una regla en el 99,6 % de los casos. Son perfiles inventados, no usuarios reales; sirven para detectar filtros demasiado duros, no para medir la satisfacción.</w:t>
       </w:r>
     </w:p>
     <w:p>
@@ -17995,7 +18167,7 @@
         <w:rPr>
           <w:rtl w:val="0"/>
         </w:rPr>
-        <w:t xml:space="preserve">Las reglas F4 y F6 nunca se disparaban con los datos reales y se rediseñaron (sección 6). Además, los filtros de clima descartaban de media 28 de los 40 países con clima templado, y una simulación con 8.000 perfiles aleatorios dejaba sin resultado al 55 %: el clima pasó a puntuar (P2) y se añadió la sección "Casi cumplen" (M1).</w:t>
+        <w:t xml:space="preserve">Las reglas F4 y F6 nunca se disparaban con los datos reales y se rediseñaron (sección 6). Además, los filtros de clima descartaban de media 28 de los 40 países con clima templado, y una simulación con 8.000 perfiles aleatorios dejaba sin resultado al 55 %: el clima pasó a puntuar (P2) y se añadió la sección "Los que más se ajustan" (M1 y M2).</w:t>
       </w:r>
     </w:p>
     <w:p>
@@ -18124,7 +18296,7 @@
         <w:rPr>
           <w:rtl w:val="0"/>
         </w:rPr>
-        <w:t xml:space="preserve">El motor se prueba con los 15 casos de la sección 10.</w:t>
+        <w:t xml:space="preserve">El motor se prueba con los 15 casos y el caso 11b de la sección 10; en la ejecución del 2026-10-23 pasan los 16.</w:t>
       </w:r>
     </w:p>
     <w:p>
@@ -18813,7 +18985,7 @@
     <w:tbl>
       <w:tblPr>
         <w:tblStyle w:val="Table11"/>
-        <w:tblW w:w="5485.0" w:type="dxa"/>
+        <w:tblW w:w="9025" w:type="dxa"/>
         <w:jc w:val="left"/>
         <w:tblBorders>
           <w:top w:color="000000" w:space="0" w:sz="0" w:val="nil"/>
@@ -18827,12 +18999,12 @@
         <w:tblLook w:val="0600"/>
       </w:tblPr>
       <w:tblGrid>
-        <w:gridCol w:w="4325"/>
-        <w:gridCol w:w="1160"/>
+        <w:gridCol w:w="3600"/>
+        <w:gridCol w:w="5425"/>
         <w:tblGridChange w:id="0">
           <w:tblGrid>
-            <w:gridCol w:w="4325"/>
-            <w:gridCol w:w="1160"/>
+            <w:gridCol w:w="3600"/>
+            <w:gridCol w:w="5425"/>
           </w:tblGrid>
         </w:tblGridChange>
       </w:tblGrid>
@@ -19034,12 +19206,16 @@
               <w:spacing w:after="240" w:before="240" w:lineRule="auto"/>
               <w:rPr/>
             </w:pPr>
-            <w:r>
-              <w:rPr>
-                <w:rtl w:val="0"/>
-              </w:rPr>
-              <w:t xml:space="preserve">pendiente</w:t>
-            </w:r>
+            <w:hyperlink r:id="rId24">
+              <w:r>
+                <w:rPr>
+                  <w:color w:val="1155cc"/>
+                  <w:u w:val="single"/>
+                  <w:rtl w:val="0"/>
+                </w:rPr>
+                <w:t xml:space="preserve">https://github.com/igorr17/Sistema-Experto</w:t>
+              </w:r>
+            </w:hyperlink>
           </w:p>
         </w:tc>
       </w:tr>

</xml_diff>

<commit_message>
Memoria: añadir sección 14 con el feedback del docente
- Resumen de los dos comentarios recibidos (botón para añadir reglas y
  visualización del recorrido de cada país por las reglas), con
  responsable, mejora prevista y estado
- La tabla de entregas remite al Word aparte con el feedback completo
- PDF regenerado

Co-Authored-By: Claude Sonnet 5.5 <noreply@anthropic.com>
</commit_message>
<xml_diff>
--- a/docs/Memoria_sistExperto.docx
+++ b/docs/Memoria_sistExperto.docx
@@ -19409,7 +19409,7 @@
               <w:rPr>
                 <w:rtl w:val="0"/>
               </w:rPr>
-              <w:t xml:space="preserve">pendiente</w:t>
+              <w:t xml:space="preserve">Archivo Word aparte (Feedback_docente_sistExperto.docx); resumen en la sección 14</w:t>
             </w:r>
           </w:p>
         </w:tc>
@@ -19480,6 +19480,579 @@
         </w:tc>
       </w:tr>
     </w:tbl>
+    <w:p>
+      <w:pPr>
+        <w:pStyle w:val="Heading2"/>
+        <w:keepNext w:val="0"/>
+        <w:keepLines w:val="0"/>
+        <w:spacing w:after="80" w:lineRule="auto"/>
+        <w:rPr>
+          <w:b w:val="1"/>
+          <w:bCs w:val="1"/>
+          <w:sz w:val="34"/>
+          <w:szCs w:val="34"/>
+        </w:rPr>
+      </w:pPr>
+      <w:r>
+        <w:rPr>
+          <w:b w:val="1"/>
+          <w:bCs w:val="1"/>
+          <w:sz w:val="34"/>
+          <w:szCs w:val="34"/>
+          <w:rtl w:val="0"/>
+        </w:rPr>
+        <w:t xml:space="preserve">14. Feedback del docente</w:t>
+      </w:r>
+    </w:p>
+    <w:p>
+      <w:pPr>
+        <w:spacing w:after="240" w:before="240" w:lineRule="auto"/>
+        <w:rPr/>
+      </w:pPr>
+      <w:r>
+        <w:rPr>
+          <w:rtl w:val="0"/>
+        </w:rPr>
+        <w:t xml:space="preserve">Resumen del feedback recibido del docente en este proyecto, con su seguimiento. El Word completo con todos los comentarios, el análisis de pautas generales y su aplicación va como archivo aparte (Feedback_docente_sistExperto.docx). [PENDIENTE: sustituir cada comentario por el texto literal del docente y rellenar la fecha de recepción.]</w:t>
+      </w:r>
+    </w:p>
+    <w:tbl>
+      <w:tblPr>
+        <w:tblStyle w:val="Table7"/>
+        <w:tblW w:w="9025" w:type="dxa"/>
+        <w:jc w:val="left"/>
+        <w:tblBorders>
+          <w:top w:color="000000" w:space="0" w:sz="0" w:val="nil"/>
+          <w:left w:color="000000" w:space="0" w:sz="0" w:val="nil"/>
+          <w:bottom w:color="000000" w:space="0" w:sz="0" w:val="nil"/>
+          <w:right w:color="000000" w:space="0" w:sz="0" w:val="nil"/>
+          <w:insideH w:color="000000" w:space="0" w:sz="0" w:val="nil"/>
+          <w:insideV w:color="000000" w:space="0" w:sz="0" w:val="nil"/>
+        </w:tblBorders>
+        <w:tblLayout w:type="fixed"/>
+        <w:tblLook w:val="0600"/>
+      </w:tblPr>
+      <w:tblGrid>
+        <w:gridCol w:w="650"/>
+        <w:gridCol w:w="1900"/>
+        <w:gridCol w:w="1700"/>
+        <w:gridCol w:w="2700"/>
+        <w:gridCol w:w="2075"/>
+        <w:tblGridChange w:id="0">
+          <w:tblGrid>
+            <w:gridCol w:w="650"/>
+            <w:gridCol w:w="1900"/>
+            <w:gridCol w:w="1700"/>
+            <w:gridCol w:w="2700"/>
+            <w:gridCol w:w="2075"/>
+          </w:tblGrid>
+        </w:tblGridChange>
+      </w:tblGrid>
+      <w:tr>
+        <w:trPr>
+          <w:cantSplit w:val="0"/>
+          <w:trHeight w:val="500" w:hRule="atLeast"/>
+          <w:tblHeader w:val="0"/>
+        </w:trPr>
+        <w:tc>
+          <w:tcPr>
+            <w:tcBorders>
+              <w:top w:color="000000" w:space="0" w:sz="0" w:val="nil"/>
+              <w:left w:color="000000" w:space="0" w:sz="0" w:val="nil"/>
+              <w:bottom w:color="000000" w:space="0" w:sz="0" w:val="nil"/>
+              <w:right w:color="000000" w:space="0" w:sz="0" w:val="nil"/>
+            </w:tcBorders>
+            <w:tcMar>
+              <w:top w:w="100.0" w:type="dxa"/>
+              <w:left w:w="100.0" w:type="dxa"/>
+              <w:bottom w:w="100.0" w:type="dxa"/>
+              <w:right w:w="100.0" w:type="dxa"/>
+            </w:tcMar>
+            <w:vAlign w:val="top"/>
+          </w:tcPr>
+          <w:p>
+            <w:pPr>
+              <w:spacing w:after="240" w:before="240" w:lineRule="auto"/>
+              <w:jc w:val="center"/>
+              <w:rPr>
+                <w:b w:val="1"/>
+                <w:bCs w:val="1"/>
+              </w:rPr>
+            </w:pPr>
+            <w:r>
+              <w:rPr>
+                <w:b w:val="1"/>
+                <w:bCs w:val="1"/>
+                <w:rtl w:val="0"/>
+              </w:rPr>
+              <w:t xml:space="preserve">N.º</w:t>
+            </w:r>
+          </w:p>
+        </w:tc>
+        <w:tc>
+          <w:tcPr>
+            <w:tcBorders>
+              <w:top w:color="000000" w:space="0" w:sz="0" w:val="nil"/>
+              <w:left w:color="000000" w:space="0" w:sz="0" w:val="nil"/>
+              <w:bottom w:color="000000" w:space="0" w:sz="0" w:val="nil"/>
+              <w:right w:color="000000" w:space="0" w:sz="0" w:val="nil"/>
+            </w:tcBorders>
+            <w:tcMar>
+              <w:top w:w="100.0" w:type="dxa"/>
+              <w:left w:w="100.0" w:type="dxa"/>
+              <w:bottom w:w="100.0" w:type="dxa"/>
+              <w:right w:w="100.0" w:type="dxa"/>
+            </w:tcMar>
+            <w:vAlign w:val="top"/>
+          </w:tcPr>
+          <w:p>
+            <w:pPr>
+              <w:spacing w:after="240" w:before="240" w:lineRule="auto"/>
+              <w:jc w:val="center"/>
+              <w:rPr>
+                <w:b w:val="1"/>
+                <w:bCs w:val="1"/>
+              </w:rPr>
+            </w:pPr>
+            <w:r>
+              <w:rPr>
+                <w:b w:val="1"/>
+                <w:bCs w:val="1"/>
+                <w:rtl w:val="0"/>
+              </w:rPr>
+              <w:t xml:space="preserve">Fecha y contexto</w:t>
+            </w:r>
+          </w:p>
+        </w:tc>
+        <w:tc>
+          <w:tcPr>
+            <w:tcBorders>
+              <w:top w:color="000000" w:space="0" w:sz="0" w:val="nil"/>
+              <w:left w:color="000000" w:space="0" w:sz="0" w:val="nil"/>
+              <w:bottom w:color="000000" w:space="0" w:sz="0" w:val="nil"/>
+              <w:right w:color="000000" w:space="0" w:sz="0" w:val="nil"/>
+            </w:tcBorders>
+            <w:tcMar>
+              <w:top w:w="100.0" w:type="dxa"/>
+              <w:left w:w="100.0" w:type="dxa"/>
+              <w:bottom w:w="100.0" w:type="dxa"/>
+              <w:right w:w="100.0" w:type="dxa"/>
+            </w:tcMar>
+            <w:vAlign w:val="top"/>
+          </w:tcPr>
+          <w:p>
+            <w:pPr>
+              <w:spacing w:after="240" w:before="240" w:lineRule="auto"/>
+              <w:jc w:val="center"/>
+              <w:rPr>
+                <w:b w:val="1"/>
+                <w:bCs w:val="1"/>
+              </w:rPr>
+            </w:pPr>
+            <w:r>
+              <w:rPr>
+                <w:b w:val="1"/>
+                <w:bCs w:val="1"/>
+                <w:rtl w:val="0"/>
+              </w:rPr>
+              <w:t xml:space="preserve">Comentario</w:t>
+            </w:r>
+          </w:p>
+        </w:tc>
+        <w:tc>
+          <w:tcPr>
+            <w:tcBorders>
+              <w:top w:color="000000" w:space="0" w:sz="0" w:val="nil"/>
+              <w:left w:color="000000" w:space="0" w:sz="0" w:val="nil"/>
+              <w:bottom w:color="000000" w:space="0" w:sz="0" w:val="nil"/>
+              <w:right w:color="000000" w:space="0" w:sz="0" w:val="nil"/>
+            </w:tcBorders>
+            <w:tcMar>
+              <w:top w:w="100.0" w:type="dxa"/>
+              <w:left w:w="100.0" w:type="dxa"/>
+              <w:bottom w:w="100.0" w:type="dxa"/>
+              <w:right w:w="100.0" w:type="dxa"/>
+            </w:tcMar>
+            <w:vAlign w:val="top"/>
+          </w:tcPr>
+          <w:p>
+            <w:pPr>
+              <w:spacing w:after="240" w:before="240" w:lineRule="auto"/>
+              <w:jc w:val="center"/>
+              <w:rPr>
+                <w:b w:val="1"/>
+                <w:bCs w:val="1"/>
+              </w:rPr>
+            </w:pPr>
+            <w:r>
+              <w:rPr>
+                <w:b w:val="1"/>
+                <w:bCs w:val="1"/>
+                <w:rtl w:val="0"/>
+              </w:rPr>
+              <w:t xml:space="preserve">Mejora y responsable</w:t>
+            </w:r>
+          </w:p>
+        </w:tc>
+        <w:tc>
+          <w:tcPr>
+            <w:tcBorders>
+              <w:top w:color="000000" w:space="0" w:sz="0" w:val="nil"/>
+              <w:left w:color="000000" w:space="0" w:sz="0" w:val="nil"/>
+              <w:bottom w:color="000000" w:space="0" w:sz="0" w:val="nil"/>
+              <w:right w:color="000000" w:space="0" w:sz="0" w:val="nil"/>
+            </w:tcBorders>
+            <w:tcMar>
+              <w:top w:w="100.0" w:type="dxa"/>
+              <w:left w:w="100.0" w:type="dxa"/>
+              <w:bottom w:w="100.0" w:type="dxa"/>
+              <w:right w:w="100.0" w:type="dxa"/>
+            </w:tcMar>
+            <w:vAlign w:val="top"/>
+          </w:tcPr>
+          <w:p>
+            <w:pPr>
+              <w:spacing w:after="240" w:before="240" w:lineRule="auto"/>
+              <w:jc w:val="center"/>
+              <w:rPr>
+                <w:b w:val="1"/>
+                <w:bCs w:val="1"/>
+              </w:rPr>
+            </w:pPr>
+            <w:r>
+              <w:rPr>
+                <w:b w:val="1"/>
+                <w:bCs w:val="1"/>
+                <w:rtl w:val="0"/>
+              </w:rPr>
+              <w:t xml:space="preserve">Estado</w:t>
+            </w:r>
+          </w:p>
+        </w:tc>
+      </w:tr>
+      <w:tr>
+        <w:trPr>
+          <w:cantSplit w:val="0"/>
+          <w:trHeight w:val="770" w:hRule="atLeast"/>
+          <w:tblHeader w:val="0"/>
+        </w:trPr>
+        <w:tc>
+          <w:tcPr>
+            <w:tcBorders>
+              <w:top w:color="000000" w:space="0" w:sz="0" w:val="nil"/>
+              <w:left w:color="000000" w:space="0" w:sz="0" w:val="nil"/>
+              <w:bottom w:color="000000" w:space="0" w:sz="0" w:val="nil"/>
+              <w:right w:color="000000" w:space="0" w:sz="0" w:val="nil"/>
+            </w:tcBorders>
+            <w:tcMar>
+              <w:top w:w="100.0" w:type="dxa"/>
+              <w:left w:w="100.0" w:type="dxa"/>
+              <w:bottom w:w="100.0" w:type="dxa"/>
+              <w:right w:w="100.0" w:type="dxa"/>
+            </w:tcMar>
+            <w:vAlign w:val="top"/>
+          </w:tcPr>
+          <w:p>
+            <w:pPr>
+              <w:spacing w:after="240" w:before="240" w:lineRule="auto"/>
+              <w:rPr/>
+            </w:pPr>
+            <w:r>
+              <w:rPr>
+                <w:rtl w:val="0"/>
+              </w:rPr>
+              <w:t xml:space="preserve">1</w:t>
+            </w:r>
+          </w:p>
+        </w:tc>
+        <w:tc>
+          <w:tcPr>
+            <w:tcBorders>
+              <w:top w:color="000000" w:space="0" w:sz="0" w:val="nil"/>
+              <w:left w:color="000000" w:space="0" w:sz="0" w:val="nil"/>
+              <w:bottom w:color="000000" w:space="0" w:sz="0" w:val="nil"/>
+              <w:right w:color="000000" w:space="0" w:sz="0" w:val="nil"/>
+            </w:tcBorders>
+            <w:tcMar>
+              <w:top w:w="100.0" w:type="dxa"/>
+              <w:left w:w="100.0" w:type="dxa"/>
+              <w:bottom w:w="100.0" w:type="dxa"/>
+              <w:right w:w="100.0" w:type="dxa"/>
+            </w:tcMar>
+            <w:vAlign w:val="top"/>
+          </w:tcPr>
+          <w:p>
+            <w:pPr>
+              <w:spacing w:after="240" w:before="240" w:lineRule="auto"/>
+              <w:rPr/>
+            </w:pPr>
+            <w:r>
+              <w:rPr>
+                <w:rtl w:val="0"/>
+              </w:rPr>
+              <w:t xml:space="preserve">[PENDIENTE: fecha de recepción]. Revisión de la aplicación durante el desarrollo.</w:t>
+            </w:r>
+          </w:p>
+        </w:tc>
+        <w:tc>
+          <w:tcPr>
+            <w:tcBorders>
+              <w:top w:color="000000" w:space="0" w:sz="0" w:val="nil"/>
+              <w:left w:color="000000" w:space="0" w:sz="0" w:val="nil"/>
+              <w:bottom w:color="000000" w:space="0" w:sz="0" w:val="nil"/>
+              <w:right w:color="000000" w:space="0" w:sz="0" w:val="nil"/>
+            </w:tcBorders>
+            <w:tcMar>
+              <w:top w:w="100.0" w:type="dxa"/>
+              <w:left w:w="100.0" w:type="dxa"/>
+              <w:bottom w:w="100.0" w:type="dxa"/>
+              <w:right w:w="100.0" w:type="dxa"/>
+            </w:tcMar>
+            <w:vAlign w:val="top"/>
+          </w:tcPr>
+          <w:p>
+            <w:pPr>
+              <w:spacing w:after="240" w:before="240" w:lineRule="auto"/>
+              <w:rPr/>
+            </w:pPr>
+            <w:r>
+              <w:rPr>
+                <w:rtl w:val="0"/>
+              </w:rPr>
+              <w:t xml:space="preserve">Añadir un botón que permita añadir nuevas reglas al sistema.</w:t>
+            </w:r>
+          </w:p>
+        </w:tc>
+        <w:tc>
+          <w:tcPr>
+            <w:tcBorders>
+              <w:top w:color="000000" w:space="0" w:sz="0" w:val="nil"/>
+              <w:left w:color="000000" w:space="0" w:sz="0" w:val="nil"/>
+              <w:bottom w:color="000000" w:space="0" w:sz="0" w:val="nil"/>
+              <w:right w:color="000000" w:space="0" w:sz="0" w:val="nil"/>
+            </w:tcBorders>
+            <w:tcMar>
+              <w:top w:w="100.0" w:type="dxa"/>
+              <w:left w:w="100.0" w:type="dxa"/>
+              <w:bottom w:w="100.0" w:type="dxa"/>
+              <w:right w:w="100.0" w:type="dxa"/>
+            </w:tcMar>
+            <w:vAlign w:val="top"/>
+          </w:tcPr>
+          <w:p>
+            <w:pPr>
+              <w:spacing w:after="240" w:before="240" w:lineRule="auto"/>
+              <w:rPr/>
+            </w:pPr>
+            <w:r>
+              <w:rPr>
+                <w:rtl w:val="0"/>
+              </w:rPr>
+              <w:t xml:space="preserve">Botón para crear reglas nuevas (filtro que descarta o aviso de conflicto) que el motor aplique junto a las existentes. Responsable: compañero (Google AI Studio).</w:t>
+            </w:r>
+          </w:p>
+        </w:tc>
+        <w:tc>
+          <w:tcPr>
+            <w:tcBorders>
+              <w:top w:color="000000" w:space="0" w:sz="0" w:val="nil"/>
+              <w:left w:color="000000" w:space="0" w:sz="0" w:val="nil"/>
+              <w:bottom w:color="000000" w:space="0" w:sz="0" w:val="nil"/>
+              <w:right w:color="000000" w:space="0" w:sz="0" w:val="nil"/>
+            </w:tcBorders>
+            <w:tcMar>
+              <w:top w:w="100.0" w:type="dxa"/>
+              <w:left w:w="100.0" w:type="dxa"/>
+              <w:bottom w:w="100.0" w:type="dxa"/>
+              <w:right w:w="100.0" w:type="dxa"/>
+            </w:tcMar>
+            <w:vAlign w:val="top"/>
+          </w:tcPr>
+          <w:p>
+            <w:pPr>
+              <w:rPr/>
+            </w:pPr>
+            <w:r>
+              <w:rPr>
+                <w:rtl w:val="0"/>
+              </w:rPr>
+              <w:t xml:space="preserve">Pendiente de implementar. Evidencia: captura de la regla creada y de su efecto.</w:t>
+            </w:r>
+          </w:p>
+        </w:tc>
+      </w:tr>
+      <w:tr>
+        <w:trPr>
+          <w:cantSplit w:val="0"/>
+          <w:trHeight w:val="770" w:hRule="atLeast"/>
+          <w:tblHeader w:val="0"/>
+        </w:trPr>
+        <w:tc>
+          <w:tcPr>
+            <w:tcBorders>
+              <w:top w:color="000000" w:space="0" w:sz="0" w:val="nil"/>
+              <w:left w:color="000000" w:space="0" w:sz="0" w:val="nil"/>
+              <w:bottom w:color="000000" w:space="0" w:sz="0" w:val="nil"/>
+              <w:right w:color="000000" w:space="0" w:sz="0" w:val="nil"/>
+            </w:tcBorders>
+            <w:tcMar>
+              <w:top w:w="100.0" w:type="dxa"/>
+              <w:left w:w="100.0" w:type="dxa"/>
+              <w:bottom w:w="100.0" w:type="dxa"/>
+              <w:right w:w="100.0" w:type="dxa"/>
+            </w:tcMar>
+            <w:vAlign w:val="top"/>
+          </w:tcPr>
+          <w:p>
+            <w:pPr>
+              <w:spacing w:after="240" w:before="240" w:lineRule="auto"/>
+              <w:rPr/>
+            </w:pPr>
+            <w:r>
+              <w:rPr>
+                <w:rtl w:val="0"/>
+              </w:rPr>
+              <w:t xml:space="preserve">2</w:t>
+            </w:r>
+          </w:p>
+        </w:tc>
+        <w:tc>
+          <w:tcPr>
+            <w:tcBorders>
+              <w:top w:color="000000" w:space="0" w:sz="0" w:val="nil"/>
+              <w:left w:color="000000" w:space="0" w:sz="0" w:val="nil"/>
+              <w:bottom w:color="000000" w:space="0" w:sz="0" w:val="nil"/>
+              <w:right w:color="000000" w:space="0" w:sz="0" w:val="nil"/>
+            </w:tcBorders>
+            <w:tcMar>
+              <w:top w:w="100.0" w:type="dxa"/>
+              <w:left w:w="100.0" w:type="dxa"/>
+              <w:bottom w:w="100.0" w:type="dxa"/>
+              <w:right w:w="100.0" w:type="dxa"/>
+            </w:tcMar>
+            <w:vAlign w:val="top"/>
+          </w:tcPr>
+          <w:p>
+            <w:pPr>
+              <w:spacing w:after="240" w:before="240" w:lineRule="auto"/>
+              <w:rPr/>
+            </w:pPr>
+            <w:r>
+              <w:rPr>
+                <w:rtl w:val="0"/>
+              </w:rPr>
+              <w:t xml:space="preserve">[PENDIENTE: fecha de recepción]. Revisión de la aplicación durante el desarrollo.</w:t>
+            </w:r>
+          </w:p>
+        </w:tc>
+        <w:tc>
+          <w:tcPr>
+            <w:tcBorders>
+              <w:top w:color="000000" w:space="0" w:sz="0" w:val="nil"/>
+              <w:left w:color="000000" w:space="0" w:sz="0" w:val="nil"/>
+              <w:bottom w:color="000000" w:space="0" w:sz="0" w:val="nil"/>
+              <w:right w:color="000000" w:space="0" w:sz="0" w:val="nil"/>
+            </w:tcBorders>
+            <w:tcMar>
+              <w:top w:w="100.0" w:type="dxa"/>
+              <w:left w:w="100.0" w:type="dxa"/>
+              <w:bottom w:w="100.0" w:type="dxa"/>
+              <w:right w:w="100.0" w:type="dxa"/>
+            </w:tcMar>
+            <w:vAlign w:val="top"/>
+          </w:tcPr>
+          <w:p>
+            <w:pPr>
+              <w:spacing w:after="240" w:before="240" w:lineRule="auto"/>
+              <w:rPr/>
+            </w:pPr>
+            <w:r>
+              <w:rPr>
+                <w:rtl w:val="0"/>
+              </w:rPr>
+              <w:t xml:space="preserve">Visualizar el proceso de selección del país: ver qué reglas sí sigue cada país, y no solo cómo se van descartando.</w:t>
+            </w:r>
+          </w:p>
+        </w:tc>
+        <w:tc>
+          <w:tcPr>
+            <w:tcBorders>
+              <w:top w:color="000000" w:space="0" w:sz="0" w:val="nil"/>
+              <w:left w:color="000000" w:space="0" w:sz="0" w:val="nil"/>
+              <w:bottom w:color="000000" w:space="0" w:sz="0" w:val="nil"/>
+              <w:right w:color="000000" w:space="0" w:sz="0" w:val="nil"/>
+            </w:tcBorders>
+            <w:tcMar>
+              <w:top w:w="100.0" w:type="dxa"/>
+              <w:left w:w="100.0" w:type="dxa"/>
+              <w:bottom w:w="100.0" w:type="dxa"/>
+              <w:right w:w="100.0" w:type="dxa"/>
+            </w:tcMar>
+            <w:vAlign w:val="top"/>
+          </w:tcPr>
+          <w:p>
+            <w:pPr>
+              <w:spacing w:after="240" w:before="240" w:lineRule="auto"/>
+              <w:rPr/>
+            </w:pPr>
+            <w:r>
+              <w:rPr>
+                <w:rtl w:val="0"/>
+              </w:rPr>
+              <w:t xml:space="preserve">Vista del recorrido de cada país por las reglas: cuáles supera, cuáles incumple y cuáles no se aplican. Responsable: compañero (Google AI Studio).</w:t>
+            </w:r>
+          </w:p>
+        </w:tc>
+        <w:tc>
+          <w:tcPr>
+            <w:tcBorders>
+              <w:top w:color="000000" w:space="0" w:sz="0" w:val="nil"/>
+              <w:left w:color="000000" w:space="0" w:sz="0" w:val="nil"/>
+              <w:bottom w:color="000000" w:space="0" w:sz="0" w:val="nil"/>
+              <w:right w:color="000000" w:space="0" w:sz="0" w:val="nil"/>
+            </w:tcBorders>
+            <w:tcMar>
+              <w:top w:w="100.0" w:type="dxa"/>
+              <w:left w:w="100.0" w:type="dxa"/>
+              <w:bottom w:w="100.0" w:type="dxa"/>
+              <w:right w:w="100.0" w:type="dxa"/>
+            </w:tcMar>
+            <w:vAlign w:val="top"/>
+          </w:tcPr>
+          <w:p>
+            <w:pPr>
+              <w:rPr/>
+            </w:pPr>
+            <w:r>
+              <w:rPr>
+                <w:rtl w:val="0"/>
+              </w:rPr>
+              <w:t xml:space="preserve">Pendiente de implementar. Evidencia: captura del recorrido de un país recomendado y de uno descartado.</w:t>
+            </w:r>
+          </w:p>
+        </w:tc>
+      </w:tr>
+    </w:tbl>
+    <w:p>
+      <w:pPr>
+        <w:spacing w:after="240" w:before="240" w:lineRule="auto"/>
+        <w:rPr/>
+      </w:pPr>
+      <w:r>
+        <w:rPr>
+          <w:b w:val="1"/>
+          <w:bCs w:val="1"/>
+          <w:rtl w:val="0"/>
+        </w:rPr>
+        <w:t xml:space="preserve">Pautas generales con IA:</w:t>
+      </w:r>
+      <w:r>
+        <w:rPr>
+          <w:rtl w:val="0"/>
+        </w:rPr>
+        <w:t xml:space="preserve"> [PENDIENTE: petición a la IA, análisis de pautas generales y valoración propia, relacionando cada pauta con los comentarios de origen y con una mejora comprobable o un descarte justificado.]</w:t>
+      </w:r>
+    </w:p>
     <w:p>
       <w:pPr>
         <w:pStyle w:val="Heading2"/>

</xml_diff>

<commit_message>
Documentación: reflejar reglas y preguntas personalizadas y el recorrido de reglas
- README: almacenamiento en localStorage, recorrido de reglas, reglas y
  preguntas personalizadas, estructura y limitaciones
- Diagrama: nota de almacenamiento con las reglas y preguntas añadidas
- Memoria: almacenamiento, reglas y preguntas añadidas, recorrido y estado
  del feedback del docente (implementado en 7e4cb49); PDF regenerado

Co-Authored-By: Claude Sonnet 5.5 <noreply@anthropic.com>
</commit_message>
<xml_diff>
--- a/docs/Memoria_sistExperto.docx
+++ b/docs/Memoria_sistExperto.docx
@@ -3926,7 +3926,7 @@
               <w:rPr>
                 <w:rtl w:val="0"/>
               </w:rPr>
-              <w:t xml:space="preserve">: 40 países con 11 atributos y clima, 8 criterios, 18 reglas y 18 preguntas</w:t>
+              <w:t xml:space="preserve">: 40 países con 11 atributos y clima, 8 criterios, 18 reglas y 18 preguntas base (el usuario puede añadir más)</w:t>
             </w:r>
           </w:p>
         </w:tc>
@@ -4157,7 +4157,7 @@
         <w:rPr>
           <w:rtl w:val="0"/>
         </w:rPr>
-        <w:t xml:space="preserve"> El conocimiento es un fichero JSON versionado en GitHub junto al código; la sesión vive en la memoria del navegador. No hay base de datos ni claves, porque los datos son estáticos (40 países, unos 113 KB) y se versionan mejor como fichero.</w:t>
+        <w:t xml:space="preserve"> El conocimiento es un fichero JSON versionado en GitHub junto al código; la sesión vive en la memoria del navegador y las reglas y preguntas que añade el usuario se guardan en el localStorage del navegador. No hay base de datos ni claves, porque los datos son estáticos (40 países, unos 113 KB) y se versionan mejor como fichero.</w:t>
       </w:r>
     </w:p>
     <w:p>
@@ -4782,36 +4782,36 @@
               <w:rPr>
                 <w:rtl w:val="0"/>
               </w:rPr>
-              <w:t xml:space="preserve">Memoria del navegador</w:t>
-            </w:r>
-          </w:p>
-        </w:tc>
-        <w:tc>
-          <w:tcPr>
-            <w:tcBorders>
-              <w:top w:color="000000" w:space="0" w:sz="0" w:val="nil"/>
-              <w:left w:color="000000" w:space="0" w:sz="0" w:val="nil"/>
-              <w:bottom w:color="000000" w:space="0" w:sz="0" w:val="nil"/>
-              <w:right w:color="000000" w:space="0" w:sz="0" w:val="nil"/>
-            </w:tcBorders>
-            <w:tcMar>
-              <w:top w:w="100.0" w:type="dxa"/>
-              <w:left w:w="100.0" w:type="dxa"/>
-              <w:bottom w:w="100.0" w:type="dxa"/>
-              <w:right w:w="100.0" w:type="dxa"/>
-            </w:tcMar>
-            <w:vAlign w:val="top"/>
-          </w:tcPr>
-          <w:p>
-            <w:pPr>
-              <w:spacing w:after="240" w:before="240" w:lineRule="auto"/>
-              <w:rPr/>
-            </w:pPr>
-            <w:r>
-              <w:rPr>
-                <w:rtl w:val="0"/>
-              </w:rPr>
-              <w:t xml:space="preserve">No hay datos personales que conservar</w:t>
+              <w:t xml:space="preserve">Memoria del navegador; localStorage para lo que añade el usuario</w:t>
+            </w:r>
+          </w:p>
+        </w:tc>
+        <w:tc>
+          <w:tcPr>
+            <w:tcBorders>
+              <w:top w:color="000000" w:space="0" w:sz="0" w:val="nil"/>
+              <w:left w:color="000000" w:space="0" w:sz="0" w:val="nil"/>
+              <w:bottom w:color="000000" w:space="0" w:sz="0" w:val="nil"/>
+              <w:right w:color="000000" w:space="0" w:sz="0" w:val="nil"/>
+            </w:tcBorders>
+            <w:tcMar>
+              <w:top w:w="100.0" w:type="dxa"/>
+              <w:left w:w="100.0" w:type="dxa"/>
+              <w:bottom w:w="100.0" w:type="dxa"/>
+              <w:right w:w="100.0" w:type="dxa"/>
+            </w:tcMar>
+            <w:vAlign w:val="top"/>
+          </w:tcPr>
+          <w:p>
+            <w:pPr>
+              <w:spacing w:after="240" w:before="240" w:lineRule="auto"/>
+              <w:rPr/>
+            </w:pPr>
+            <w:r>
+              <w:rPr>
+                <w:rtl w:val="0"/>
+              </w:rPr>
+              <w:t xml:space="preserve">No hay datos personales que conservar; lo añadido por el usuario queda solo en su navegador</w:t>
             </w:r>
           </w:p>
         </w:tc>
@@ -11021,6 +11021,26 @@
           <w:rtl w:val="0"/>
         </w:rPr>
         <w:t xml:space="preserve"> F4 y F6 estaban escritas para "visado consular" y "vacuna obligatoria", pero ninguno de los 40 países exige esas cosas a un español, así que nunca se disparaban. F4 pasó a comparar un nivel de trámite (0 sin trámite, 1 autorización electrónica, 2 visado a la llegada o electrónico, 3 visado consular) y F6 pasó a "recomendaciones relevantes". También el clima dejó de ser un filtro: con clima templado descartaba de media 28 de los 40 países (31 en enero), así que ahora puntúa (P2) y solo elimina si el usuario le da peso 5 (F10).</w:t>
+      </w:r>
+    </w:p>
+    <w:p>
+      <w:pPr>
+        <w:spacing w:after="240" w:before="240" w:lineRule="auto"/>
+        <w:rPr/>
+      </w:pPr>
+      <w:r>
+        <w:rPr>
+          <w:b w:val="1"/>
+          <w:bCs w:val="1"/>
+          <w:rtl w:val="0"/>
+        </w:rPr>
+        <w:t xml:space="preserve">Reglas añadidas por el usuario.</w:t>
+      </w:r>
+      <w:r>
+        <w:rPr>
+          <w:rtl w:val="0"/>
+        </w:rPr>
+        <w:t xml:space="preserve"> El botón "Añadir nueva regla" crea reglas de dos tipos: un filtro que descarta países y un conflicto que solo avisa. Se guardan en el localStorage del navegador, se suman a las 18 reglas base al cargar la aplicación y se pueden activar, desactivar y borrar. No se escriben en knowledge.json.</w:t>
       </w:r>
     </w:p>
     <w:p>
@@ -13873,6 +13893,26 @@
     </w:p>
     <w:p>
       <w:pPr>
+        <w:spacing w:after="240" w:before="240" w:lineRule="auto"/>
+        <w:rPr/>
+      </w:pPr>
+      <w:r>
+        <w:rPr>
+          <w:b w:val="1"/>
+          <w:bCs w:val="1"/>
+          <w:rtl w:val="0"/>
+        </w:rPr>
+        <w:t xml:space="preserve">Preguntas añadidas por el usuario.</w:t>
+      </w:r>
+      <w:r>
+        <w:rPr>
+          <w:rtl w:val="0"/>
+        </w:rPr>
+        <w:t xml:space="preserve"> El botón "Añadir pregunta" permite crear preguntas de restricción o de preferencia, de opción única, escala de 1 a 5 o número. También se guardan en el localStorage del navegador y se suman a las 18 preguntas base.</w:t>
+      </w:r>
+    </w:p>
+    <w:p>
+      <w:pPr>
         <w:pStyle w:val="Heading2"/>
         <w:keepNext w:val="0"/>
         <w:keepLines w:val="0"/>
@@ -14011,6 +14051,26 @@
           <w:rtl w:val="0"/>
         </w:rPr>
         <w:t xml:space="preserve"> un comparador de destinos, que pone frente a frente 2 o 3 países marcados en el resultado (compatibilidad, coste diario, horas de vuelo, seguridad, requisitos de entrada, restricciones incumplidas, afinidad en los 8 criterios y clima del mes), y un simulador de sensibilidad, que permite mover el presupuesto, el límite de vuelo, el mes y el peso de cada criterio (de 0 a 5) y recalcula el resultado al momento.</w:t>
+      </w:r>
+    </w:p>
+    <w:p>
+      <w:pPr>
+        <w:spacing w:after="240" w:before="240" w:lineRule="auto"/>
+        <w:rPr/>
+      </w:pPr>
+      <w:r>
+        <w:rPr>
+          <w:b w:val="1"/>
+          <w:bCs w:val="1"/>
+          <w:rtl w:val="0"/>
+        </w:rPr>
+        <w:t xml:space="preserve">Recorrido y gestor de reglas:</w:t>
+      </w:r>
+      <w:r>
+        <w:rPr>
+          <w:rtl w:val="0"/>
+        </w:rPr>
+        <w:t xml:space="preserve"> el panel "Reglas que SÍ sigue el motor" de Resultados y la vista de reglas (#/rules) muestran qué reglas sigue el motor, y no solo cuáles descartan: deducciones D1 y D2, filtros superados, ponderación P1 y P2 y metarreglas M1 a M3. La vista tiene tres pestañas (reglas que sí sigue el proceso, base de conocimiento de reglas e historial de descartes) y desde ella se añaden, activan, desactivan y borran las reglas personalizadas.</w:t>
       </w:r>
     </w:p>
     <w:p>
@@ -19876,7 +19936,7 @@
               <w:rPr>
                 <w:rtl w:val="0"/>
               </w:rPr>
-              <w:t xml:space="preserve">Pendiente de implementar. Evidencia: captura de la regla creada y de su efecto.</w:t>
+              <w:t xml:space="preserve">Implementado (commit 7e4cb49, 2026-10-28). Evidencia pendiente: captura de la regla creada y de su efecto.</w:t>
             </w:r>
           </w:p>
         </w:tc>
@@ -19999,35 +20059,35 @@
               <w:rPr>
                 <w:rtl w:val="0"/>
               </w:rPr>
-              <w:t xml:space="preserve">Vista del recorrido de cada país por las reglas: cuáles supera, cuáles incumple y cuáles no se aplican. Responsable: compañero (Google AI Studio).</w:t>
-            </w:r>
-          </w:p>
-        </w:tc>
-        <w:tc>
-          <w:tcPr>
-            <w:tcBorders>
-              <w:top w:color="000000" w:space="0" w:sz="0" w:val="nil"/>
-              <w:left w:color="000000" w:space="0" w:sz="0" w:val="nil"/>
-              <w:bottom w:color="000000" w:space="0" w:sz="0" w:val="nil"/>
-              <w:right w:color="000000" w:space="0" w:sz="0" w:val="nil"/>
-            </w:tcBorders>
-            <w:tcMar>
-              <w:top w:w="100.0" w:type="dxa"/>
-              <w:left w:w="100.0" w:type="dxa"/>
-              <w:bottom w:w="100.0" w:type="dxa"/>
-              <w:right w:w="100.0" w:type="dxa"/>
-            </w:tcMar>
-            <w:vAlign w:val="top"/>
-          </w:tcPr>
-          <w:p>
-            <w:pPr>
-              <w:rPr/>
-            </w:pPr>
-            <w:r>
-              <w:rPr>
-                <w:rtl w:val="0"/>
-              </w:rPr>
-              <w:t xml:space="preserve">Pendiente de implementar. Evidencia: captura del recorrido de un país recomendado y de uno descartado.</w:t>
+              <w:t xml:space="preserve">Panel y vista que muestran las reglas que sí sigue el motor (deducciones, filtros superados, ponderación y metarreglas), además de los descartes. Responsable: compañero (Google AI Studio).</w:t>
+            </w:r>
+          </w:p>
+        </w:tc>
+        <w:tc>
+          <w:tcPr>
+            <w:tcBorders>
+              <w:top w:color="000000" w:space="0" w:sz="0" w:val="nil"/>
+              <w:left w:color="000000" w:space="0" w:sz="0" w:val="nil"/>
+              <w:bottom w:color="000000" w:space="0" w:sz="0" w:val="nil"/>
+              <w:right w:color="000000" w:space="0" w:sz="0" w:val="nil"/>
+            </w:tcBorders>
+            <w:tcMar>
+              <w:top w:w="100.0" w:type="dxa"/>
+              <w:left w:w="100.0" w:type="dxa"/>
+              <w:bottom w:w="100.0" w:type="dxa"/>
+              <w:right w:w="100.0" w:type="dxa"/>
+            </w:tcMar>
+            <w:vAlign w:val="top"/>
+          </w:tcPr>
+          <w:p>
+            <w:pPr>
+              <w:rPr/>
+            </w:pPr>
+            <w:r>
+              <w:rPr>
+                <w:rtl w:val="0"/>
+              </w:rPr>
+              <w:t xml:space="preserve">Implementado (commit 7e4cb49, 2026-10-28). Evidencia pendiente: captura del panel de reglas seguidas y de la vista de trazabilidad.</w:t>
             </w:r>
           </w:p>
         </w:tc>

</xml_diff>